<commit_message>
update doc and ppt
</commit_message>
<xml_diff>
--- a/PROJECT_REPORT.docx
+++ b/PROJECT_REPORT.docx
@@ -834,9 +834,6 @@
     <w:p>
       <w:pPr>
         <w:pStyle w:val="a0"/>
-        <w:rPr>
-          <w:rFonts w:hint="eastAsia"/>
-        </w:rPr>
       </w:pPr>
       <w:r>
         <w:t>This results in 1,250 high-value reviews and 8,750 low-value reviews. The class imbalance is realistic, as only a small proportion of reviews are considered highly useful by users. At the same time, the proxy label is imperfect: helpful votes may depend on factors such as product popularity, review visibility, and time since posting. Therefore, review-value classification should be interpreted as a proxy task rather than a human-annotated review-quality benchmark.</w:t>
@@ -1151,14 +1148,19 @@
       <w:bookmarkEnd w:id="3"/>
       <w:bookmarkEnd w:id="8"/>
       <w:r>
-        <w:t>4. System Design and Solution Approach</w:t>
-      </w:r>
+        <w:t xml:space="preserve">4. </w:t>
+      </w:r>
+      <w:bookmarkStart w:id="10" w:name="OLE_LINK1"/>
+      <w:r>
+        <w:t>System Design and Solution Approach</w:t>
+      </w:r>
+      <w:bookmarkEnd w:id="10"/>
     </w:p>
     <w:p>
       <w:pPr>
         <w:pStyle w:val="3"/>
       </w:pPr>
-      <w:bookmarkStart w:id="10" w:name="overall-architecture"/>
+      <w:bookmarkStart w:id="11" w:name="overall-architecture"/>
       <w:r>
         <w:t>4.1 Overall Architecture</w:t>
       </w:r>
@@ -1265,9 +1267,6 @@
       <w:pPr>
         <w:pStyle w:val="FirstParagraph"/>
         <w:jc w:val="center"/>
-        <w:rPr>
-          <w:rFonts w:hint="eastAsia"/>
-        </w:rPr>
       </w:pPr>
       <w:r>
         <w:rPr>
@@ -1390,8 +1389,8 @@
       <w:pPr>
         <w:pStyle w:val="3"/>
       </w:pPr>
-      <w:bookmarkStart w:id="11" w:name="text-cleaning-and-preprocessing"/>
-      <w:bookmarkEnd w:id="10"/>
+      <w:bookmarkStart w:id="12" w:name="text-cleaning-and-preprocessing"/>
+      <w:bookmarkEnd w:id="11"/>
       <w:r>
         <w:t>4.2 Text Cleaning and Preprocessing</w:t>
       </w:r>
@@ -1416,8 +1415,8 @@
       <w:pPr>
         <w:pStyle w:val="3"/>
       </w:pPr>
-      <w:bookmarkStart w:id="12" w:name="review-value-classification"/>
-      <w:bookmarkEnd w:id="11"/>
+      <w:bookmarkStart w:id="13" w:name="review-value-classification"/>
+      <w:bookmarkEnd w:id="12"/>
       <w:r>
         <w:t>4.3 Review-Value Classification</w:t>
       </w:r>
@@ -1462,8 +1461,8 @@
       <w:pPr>
         <w:pStyle w:val="3"/>
       </w:pPr>
-      <w:bookmarkStart w:id="13" w:name="sentiment-mining"/>
-      <w:bookmarkEnd w:id="12"/>
+      <w:bookmarkStart w:id="14" w:name="sentiment-mining"/>
+      <w:bookmarkEnd w:id="13"/>
       <w:r>
         <w:t>4.4 Sentiment Mining</w:t>
       </w:r>
@@ -1804,8 +1803,8 @@
       <w:pPr>
         <w:pStyle w:val="3"/>
       </w:pPr>
-      <w:bookmarkStart w:id="14" w:name="complaint-title-generation"/>
-      <w:bookmarkEnd w:id="13"/>
+      <w:bookmarkStart w:id="15" w:name="complaint-title-generation"/>
+      <w:bookmarkEnd w:id="14"/>
       <w:r>
         <w:lastRenderedPageBreak/>
         <w:t>4.5 Complaint-Title Generation</w:t>
@@ -2327,8 +2326,8 @@
       <w:pPr>
         <w:pStyle w:val="3"/>
       </w:pPr>
-      <w:bookmarkStart w:id="15" w:name="dashboard-and-merchant-copilot"/>
-      <w:bookmarkEnd w:id="14"/>
+      <w:bookmarkStart w:id="16" w:name="dashboard-and-merchant-copilot"/>
+      <w:bookmarkEnd w:id="15"/>
       <w:r>
         <w:t>4.6 Dashboard and Merchant Copilot</w:t>
       </w:r>
@@ -2355,6 +2354,9 @@
         <w:jc w:val="center"/>
       </w:pPr>
       <w:r>
+        <w:rPr>
+          <w:noProof/>
+        </w:rPr>
         <w:drawing>
           <wp:inline distT="0" distB="0" distL="0" distR="0" wp14:anchorId="14A3C40C" wp14:editId="5E657D0D">
             <wp:extent cx="5486400" cy="2731135"/>
@@ -2406,6 +2408,9 @@
         <w:jc w:val="center"/>
       </w:pPr>
       <w:r>
+        <w:rPr>
+          <w:noProof/>
+        </w:rPr>
         <w:lastRenderedPageBreak/>
         <w:drawing>
           <wp:inline distT="0" distB="0" distL="0" distR="0" wp14:anchorId="290A2D2D" wp14:editId="63D6BAD1">
@@ -2466,6 +2471,9 @@
         <w:jc w:val="center"/>
       </w:pPr>
       <w:r>
+        <w:rPr>
+          <w:noProof/>
+        </w:rPr>
         <w:drawing>
           <wp:inline distT="0" distB="0" distL="0" distR="0" wp14:anchorId="6ED4BEC1" wp14:editId="2BF856C4">
             <wp:extent cx="5486400" cy="2075815"/>
@@ -2508,6 +2516,9 @@
         <w:pStyle w:val="FirstParagraph"/>
       </w:pPr>
       <w:r>
+        <w:rPr>
+          <w:noProof/>
+        </w:rPr>
         <w:drawing>
           <wp:inline distT="0" distB="0" distL="0" distR="0" wp14:anchorId="7CCAC2AB" wp14:editId="1BAA7A22">
             <wp:extent cx="5486400" cy="1315085"/>
@@ -2548,9 +2559,6 @@
     <w:p>
       <w:pPr>
         <w:pStyle w:val="FirstParagraph"/>
-        <w:rPr>
-          <w:rFonts w:hint="eastAsia"/>
-        </w:rPr>
       </w:pPr>
       <w:r>
         <w:t xml:space="preserve">From a system perspective, the dashboard is the integration layer of the project. It combines review-value prediction, sentiment inference, complaint-title generation, CSV upload analysis, and conversational interaction into a coherent workflow. </w:t>
@@ -2564,9 +2572,9 @@
       <w:pPr>
         <w:pStyle w:val="2"/>
       </w:pPr>
-      <w:bookmarkStart w:id="16" w:name="evaluation-and-test-results"/>
+      <w:bookmarkStart w:id="17" w:name="evaluation-and-test-results"/>
       <w:bookmarkEnd w:id="9"/>
-      <w:bookmarkEnd w:id="15"/>
+      <w:bookmarkEnd w:id="16"/>
       <w:r>
         <w:t>5. Evaluation and Test Results</w:t>
       </w:r>
@@ -2575,7 +2583,7 @@
       <w:pPr>
         <w:pStyle w:val="3"/>
       </w:pPr>
-      <w:bookmarkStart w:id="17" w:name="evaluation-setup"/>
+      <w:bookmarkStart w:id="18" w:name="evaluation-setup"/>
       <w:r>
         <w:t>5.1 Evaluation Setup</w:t>
       </w:r>
@@ -2747,8 +2755,8 @@
       <w:pPr>
         <w:pStyle w:val="3"/>
       </w:pPr>
-      <w:bookmarkStart w:id="18" w:name="review-value-classification-results"/>
-      <w:bookmarkEnd w:id="17"/>
+      <w:bookmarkStart w:id="19" w:name="review-value-classification-results"/>
+      <w:bookmarkEnd w:id="18"/>
       <w:r>
         <w:t>5.2 Review-Value Classification Results</w:t>
       </w:r>
@@ -2945,8 +2953,8 @@
       <w:pPr>
         <w:pStyle w:val="3"/>
       </w:pPr>
-      <w:bookmarkStart w:id="19" w:name="sentiment-mining-results"/>
-      <w:bookmarkEnd w:id="18"/>
+      <w:bookmarkStart w:id="20" w:name="sentiment-mining-results"/>
+      <w:bookmarkEnd w:id="19"/>
       <w:r>
         <w:t>5.3 Sentiment Mining Results</w:t>
       </w:r>
@@ -3172,8 +3180,8 @@
       <w:pPr>
         <w:pStyle w:val="3"/>
       </w:pPr>
-      <w:bookmarkStart w:id="20" w:name="complaint-title-generation-results"/>
-      <w:bookmarkEnd w:id="19"/>
+      <w:bookmarkStart w:id="21" w:name="complaint-title-generation-results"/>
+      <w:bookmarkEnd w:id="20"/>
       <w:r>
         <w:t>5.4 Complaint-Title Generation Results</w:t>
       </w:r>
@@ -3441,8 +3449,8 @@
       <w:pPr>
         <w:pStyle w:val="3"/>
       </w:pPr>
-      <w:bookmarkStart w:id="21" w:name="qualitative-analysis"/>
-      <w:bookmarkEnd w:id="20"/>
+      <w:bookmarkStart w:id="22" w:name="qualitative-analysis"/>
+      <w:bookmarkEnd w:id="21"/>
       <w:r>
         <w:t>5.5 Qualitative Analysis</w:t>
       </w:r>
@@ -3728,6 +3736,7 @@
         <w:pStyle w:val="a0"/>
       </w:pPr>
       <w:r>
+        <w:lastRenderedPageBreak/>
         <w:t>This qualitative check is not a full benchmark, but it supports the test metrics: fine-tuning makes the title generator more concise and more aligned with the complaint-title format.</w:t>
       </w:r>
     </w:p>
@@ -3735,9 +3744,9 @@
       <w:pPr>
         <w:pStyle w:val="2"/>
       </w:pPr>
-      <w:bookmarkStart w:id="22" w:name="limitations-and-future-work"/>
-      <w:bookmarkEnd w:id="16"/>
-      <w:bookmarkEnd w:id="21"/>
+      <w:bookmarkStart w:id="23" w:name="limitations-and-future-work"/>
+      <w:bookmarkEnd w:id="17"/>
+      <w:bookmarkEnd w:id="22"/>
       <w:r>
         <w:t>6. Limitations and Future Work</w:t>
       </w:r>
@@ -3793,9 +3802,6 @@
     <w:p>
       <w:pPr>
         <w:pStyle w:val="a0"/>
-        <w:rPr>
-          <w:rFonts w:hint="eastAsia"/>
-        </w:rPr>
       </w:pPr>
       <w:r>
         <w:t xml:space="preserve">Future work includes constructing a human-annotated dataset to evaluate review value, sentiment and complaint title quality. It will enhance high-value review detection by leveraging structural features like ratings and verified </w:t>
@@ -3813,8 +3819,8 @@
       <w:pPr>
         <w:pStyle w:val="2"/>
       </w:pPr>
-      <w:bookmarkStart w:id="23" w:name="conclusion"/>
-      <w:bookmarkEnd w:id="22"/>
+      <w:bookmarkStart w:id="24" w:name="conclusion"/>
+      <w:bookmarkEnd w:id="23"/>
       <w:r>
         <w:lastRenderedPageBreak/>
         <w:t>7. Conclusion</w:t>
@@ -3848,8 +3854,8 @@
       <w:pPr>
         <w:pStyle w:val="2"/>
       </w:pPr>
-      <w:bookmarkStart w:id="24" w:name="references"/>
-      <w:bookmarkEnd w:id="23"/>
+      <w:bookmarkStart w:id="25" w:name="references"/>
+      <w:bookmarkEnd w:id="24"/>
       <w:r>
         <w:t>8. References</w:t>
       </w:r>
@@ -3866,7 +3872,7 @@
       <w:pPr>
         <w:pStyle w:val="3"/>
       </w:pPr>
-      <w:bookmarkStart w:id="25" w:name="dataset"/>
+      <w:bookmarkStart w:id="26" w:name="dataset"/>
       <w:r>
         <w:t>8.1 Dataset</w:t>
       </w:r>
@@ -3895,8 +3901,8 @@
       <w:pPr>
         <w:pStyle w:val="3"/>
       </w:pPr>
-      <w:bookmarkStart w:id="26" w:name="pre-trained-models"/>
-      <w:bookmarkEnd w:id="25"/>
+      <w:bookmarkStart w:id="27" w:name="pre-trained-models"/>
+      <w:bookmarkEnd w:id="26"/>
       <w:r>
         <w:t>8.2 Pre-trained Models</w:t>
       </w:r>
@@ -3988,8 +3994,8 @@
       <w:pPr>
         <w:pStyle w:val="3"/>
       </w:pPr>
-      <w:bookmarkStart w:id="27" w:name="libraries-and-tools"/>
-      <w:bookmarkEnd w:id="26"/>
+      <w:bookmarkStart w:id="28" w:name="libraries-and-tools"/>
+      <w:bookmarkEnd w:id="27"/>
       <w:r>
         <w:lastRenderedPageBreak/>
         <w:t>8.3 Libraries and Tools</w:t>
@@ -4272,8 +4278,8 @@
       <w:pPr>
         <w:pStyle w:val="3"/>
       </w:pPr>
-      <w:bookmarkStart w:id="28" w:name="source-code"/>
-      <w:bookmarkEnd w:id="27"/>
+      <w:bookmarkStart w:id="29" w:name="source-code"/>
+      <w:bookmarkEnd w:id="28"/>
       <w:r>
         <w:t>8.4 Source Code</w:t>
       </w:r>
@@ -4307,9 +4313,9 @@
       <w:pPr>
         <w:pStyle w:val="2"/>
       </w:pPr>
-      <w:bookmarkStart w:id="29" w:name="X74cf52754ce356f32bc42912e24735181ee320a"/>
-      <w:bookmarkEnd w:id="24"/>
-      <w:bookmarkEnd w:id="28"/>
+      <w:bookmarkStart w:id="30" w:name="X74cf52754ce356f32bc42912e24735181ee320a"/>
+      <w:bookmarkEnd w:id="25"/>
+      <w:bookmarkEnd w:id="29"/>
       <w:r>
         <w:lastRenderedPageBreak/>
         <w:t>9. Individual Contribution of Each Team Member in the Project</w:t>
@@ -4416,14 +4422,14 @@
       <w:pPr>
         <w:pStyle w:val="2"/>
       </w:pPr>
-      <w:bookmarkStart w:id="30" w:name="usage-of-genai-llms"/>
-      <w:bookmarkEnd w:id="29"/>
+      <w:bookmarkStart w:id="31" w:name="usage-of-genai-llms"/>
+      <w:bookmarkEnd w:id="30"/>
       <w:r>
         <w:t>10. Usage of GenAI / LLMs</w:t>
       </w:r>
     </w:p>
     <w:bookmarkEnd w:id="0"/>
-    <w:bookmarkEnd w:id="30"/>
+    <w:bookmarkEnd w:id="31"/>
     <w:p>
       <w:pPr>
         <w:pStyle w:val="FirstParagraph"/>
@@ -5361,6 +5367,7 @@
   <w:style w:type="character" w:default="1" w:styleId="a1">
     <w:name w:val="Default Paragraph Font"/>
     <w:uiPriority w:val="1"/>
+    <w:semiHidden/>
     <w:unhideWhenUsed/>
   </w:style>
   <w:style w:type="table" w:default="1" w:styleId="a2">

</xml_diff>

<commit_message>
docs+models: align report and review-value artifacts
</commit_message>
<xml_diff>
--- a/PROJECT_REPORT.docx
+++ b/PROJECT_REPORT.docx
@@ -2831,12 +2831,8 @@
             <w:tcW w:w="1276" w:type="dxa"/>
           </w:tcPr>
           <w:p>
-            <w:pPr>
-              <w:pStyle w:val="Compact"/>
-              <w:jc w:val="center"/>
-            </w:pPr>
-            <w:r>
-              <w:t>0.840</w:t>
+            <w:r>
+              <w:t>0.795</w:t>
             </w:r>
           </w:p>
         </w:tc>
@@ -2864,12 +2860,8 @@
             <w:tcW w:w="1276" w:type="dxa"/>
           </w:tcPr>
           <w:p>
-            <w:pPr>
-              <w:pStyle w:val="Compact"/>
-              <w:jc w:val="center"/>
-            </w:pPr>
-            <w:r>
-              <w:t>0.434</w:t>
+            <w:r>
+              <w:t>0.254</w:t>
             </w:r>
           </w:p>
         </w:tc>
@@ -2897,12 +2889,8 @@
             <w:tcW w:w="1276" w:type="dxa"/>
           </w:tcPr>
           <w:p>
-            <w:pPr>
-              <w:pStyle w:val="Compact"/>
-              <w:jc w:val="center"/>
-            </w:pPr>
-            <w:r>
-              <w:t>0.404</w:t>
+            <w:r>
+              <w:t>0.255</w:t>
             </w:r>
           </w:p>
         </w:tc>
@@ -2930,12 +2918,8 @@
             <w:tcW w:w="1276" w:type="dxa"/>
           </w:tcPr>
           <w:p>
-            <w:pPr>
-              <w:pStyle w:val="Compact"/>
-              <w:jc w:val="center"/>
-            </w:pPr>
-            <w:r>
-              <w:t>0.418</w:t>
+            <w:r>
+              <w:t>0.255</w:t>
             </w:r>
           </w:p>
         </w:tc>
@@ -2946,7 +2930,7 @@
         <w:pStyle w:val="a0"/>
       </w:pPr>
       <w:r>
-        <w:t>Because high-value reviews are the minority class, accuracy alone is not sufficient. The positive-class F1 score of 0.418 shows that this component is still the weakest part of the pipeline. It can still be used as a prioritisation signal, but it should not be treated as a perfect detector of business value.</w:t>
+        <w:t>Because high-value reviews are the minority class, accuracy alone is not sufficient. The positive-class F1 score of 0.255 shows that this component is still the weakest part of the pipeline. It can still be used as a prioritisation signal, but it should not be treated as a perfect detector of business value.</w:t>
       </w:r>
     </w:p>
     <w:p>

</xml_diff>

<commit_message>
fix: use native review expanders and update report
</commit_message>
<xml_diff>
--- a/PROJECT_REPORT.docx
+++ b/PROJECT_REPORT.docx
@@ -4,48 +4,2166 @@
   <w:body>
     <w:p>
       <w:pPr>
-        <w:pStyle w:val="a4"/>
-      </w:pPr>
-      <w:r>
-        <w:t>Review Insight System Project Report</w:t>
-      </w:r>
-    </w:p>
-    <w:p>
-      <w:pPr>
         <w:pStyle w:val="1"/>
       </w:pPr>
-      <w:bookmarkStart w:id="0" w:name="X1c31e062a79e80478a4be28c6e642d1e48a8528"/>
       <w:r>
         <w:t>Review Insight System: Business-Oriented Language Processing for E-Commerce Review Analytics</w:t>
       </w:r>
     </w:p>
     <w:p>
       <w:pPr>
+        <w:spacing w:before="80" w:after="0"/>
+        <w:jc w:val="center"/>
+      </w:pPr>
+      <w:r>
+        <w:rPr>
+          <w:b/>
+          <w:color w:val="123D52"/>
+        </w:rPr>
+        <w:t>Zhao Yisen</w:t>
+      </w:r>
+    </w:p>
+    <w:p>
+      <w:pPr>
+        <w:spacing w:after="280"/>
+        <w:jc w:val="center"/>
+      </w:pPr>
+      <w:r>
+        <w:rPr>
+          <w:b/>
+          <w:color w:val="123D52"/>
+        </w:rPr>
+        <w:t>Group 14</w:t>
+      </w:r>
+    </w:p>
+    <w:p>
+      <w:pPr>
+        <w:spacing w:before="360" w:after="240"/>
+      </w:pPr>
+      <w:r>
+        <w:rPr>
+          <w:b/>
+          <w:sz w:val="32"/>
+        </w:rPr>
+        <w:t>Table of Contents</w:t>
+      </w:r>
+    </w:p>
+    <w:p>
+      <w:pPr>
+        <w:pStyle w:val="TOC2"/>
+        <w:tabs>
+          <w:tab w:val="right" w:leader="dot" w:pos="8630"/>
+        </w:tabs>
+        <w:ind w:left="480"/>
+        <w:rPr>
+          <w:noProof/>
+        </w:rPr>
+      </w:pPr>
+      <w:r>
+        <w:fldChar w:fldCharType="begin"/>
+      </w:r>
+      <w:r>
+        <w:instrText xml:space="preserve"> TOC \o "2-3" \h \z \u </w:instrText>
+      </w:r>
+      <w:r>
+        <w:fldChar w:fldCharType="separate"/>
+      </w:r>
+      <w:hyperlink w:anchor="_Toc228470851" w:history="1">
+        <w:r>
+          <w:rPr>
+            <w:rStyle w:val="af"/>
+            <w:noProof/>
+          </w:rPr>
+          <w:t>1. Introduction and Business Problem</w:t>
+        </w:r>
+        <w:r>
+          <w:rPr>
+            <w:noProof/>
+            <w:webHidden/>
+          </w:rPr>
+          <w:tab/>
+        </w:r>
+        <w:r>
+          <w:rPr>
+            <w:noProof/>
+            <w:webHidden/>
+          </w:rPr>
+          <w:fldChar w:fldCharType="begin"/>
+        </w:r>
+        <w:r>
+          <w:rPr>
+            <w:noProof/>
+            <w:webHidden/>
+          </w:rPr>
+          <w:instrText xml:space="preserve"> PAGEREF _Toc228470851 \h </w:instrText>
+        </w:r>
+        <w:r>
+          <w:rPr>
+            <w:noProof/>
+            <w:webHidden/>
+          </w:rPr>
+        </w:r>
+        <w:r>
+          <w:rPr>
+            <w:noProof/>
+            <w:webHidden/>
+          </w:rPr>
+          <w:fldChar w:fldCharType="separate"/>
+        </w:r>
+        <w:r>
+          <w:rPr>
+            <w:noProof/>
+            <w:webHidden/>
+          </w:rPr>
+          <w:t>3</w:t>
+        </w:r>
+        <w:r>
+          <w:rPr>
+            <w:noProof/>
+            <w:webHidden/>
+          </w:rPr>
+          <w:fldChar w:fldCharType="end"/>
+        </w:r>
+      </w:hyperlink>
+    </w:p>
+    <w:p>
+      <w:pPr>
+        <w:pStyle w:val="TOC2"/>
+        <w:tabs>
+          <w:tab w:val="right" w:leader="dot" w:pos="8630"/>
+        </w:tabs>
+        <w:ind w:left="480"/>
+        <w:rPr>
+          <w:noProof/>
+        </w:rPr>
+      </w:pPr>
+      <w:hyperlink w:anchor="_Toc228470852" w:history="1">
+        <w:r>
+          <w:rPr>
+            <w:rStyle w:val="af"/>
+            <w:noProof/>
+          </w:rPr>
+          <w:t>2. Alignment with Practice Module Requirements</w:t>
+        </w:r>
+        <w:r>
+          <w:rPr>
+            <w:noProof/>
+            <w:webHidden/>
+          </w:rPr>
+          <w:tab/>
+        </w:r>
+        <w:r>
+          <w:rPr>
+            <w:noProof/>
+            <w:webHidden/>
+          </w:rPr>
+          <w:fldChar w:fldCharType="begin"/>
+        </w:r>
+        <w:r>
+          <w:rPr>
+            <w:noProof/>
+            <w:webHidden/>
+          </w:rPr>
+          <w:instrText xml:space="preserve"> PAGEREF _Toc228470852 \h </w:instrText>
+        </w:r>
+        <w:r>
+          <w:rPr>
+            <w:noProof/>
+            <w:webHidden/>
+          </w:rPr>
+        </w:r>
+        <w:r>
+          <w:rPr>
+            <w:noProof/>
+            <w:webHidden/>
+          </w:rPr>
+          <w:fldChar w:fldCharType="separate"/>
+        </w:r>
+        <w:r>
+          <w:rPr>
+            <w:noProof/>
+            <w:webHidden/>
+          </w:rPr>
+          <w:t>3</w:t>
+        </w:r>
+        <w:r>
+          <w:rPr>
+            <w:noProof/>
+            <w:webHidden/>
+          </w:rPr>
+          <w:fldChar w:fldCharType="end"/>
+        </w:r>
+      </w:hyperlink>
+    </w:p>
+    <w:p>
+      <w:pPr>
+        <w:pStyle w:val="TOC2"/>
+        <w:tabs>
+          <w:tab w:val="right" w:leader="dot" w:pos="8630"/>
+        </w:tabs>
+        <w:ind w:left="480"/>
+        <w:rPr>
+          <w:noProof/>
+        </w:rPr>
+      </w:pPr>
+      <w:hyperlink w:anchor="_Toc228470853" w:history="1">
+        <w:r>
+          <w:rPr>
+            <w:rStyle w:val="af"/>
+            <w:noProof/>
+          </w:rPr>
+          <w:t>3. Datasets</w:t>
+        </w:r>
+        <w:r>
+          <w:rPr>
+            <w:noProof/>
+            <w:webHidden/>
+          </w:rPr>
+          <w:tab/>
+        </w:r>
+        <w:r>
+          <w:rPr>
+            <w:noProof/>
+            <w:webHidden/>
+          </w:rPr>
+          <w:fldChar w:fldCharType="begin"/>
+        </w:r>
+        <w:r>
+          <w:rPr>
+            <w:noProof/>
+            <w:webHidden/>
+          </w:rPr>
+          <w:instrText xml:space="preserve"> PAGEREF _Toc228470853 \h </w:instrText>
+        </w:r>
+        <w:r>
+          <w:rPr>
+            <w:noProof/>
+            <w:webHidden/>
+          </w:rPr>
+        </w:r>
+        <w:r>
+          <w:rPr>
+            <w:noProof/>
+            <w:webHidden/>
+          </w:rPr>
+          <w:fldChar w:fldCharType="separate"/>
+        </w:r>
+        <w:r>
+          <w:rPr>
+            <w:noProof/>
+            <w:webHidden/>
+          </w:rPr>
+          <w:t>4</w:t>
+        </w:r>
+        <w:r>
+          <w:rPr>
+            <w:noProof/>
+            <w:webHidden/>
+          </w:rPr>
+          <w:fldChar w:fldCharType="end"/>
+        </w:r>
+      </w:hyperlink>
+    </w:p>
+    <w:p>
+      <w:pPr>
+        <w:pStyle w:val="TOC3"/>
+        <w:tabs>
+          <w:tab w:val="right" w:leader="dot" w:pos="8630"/>
+        </w:tabs>
+        <w:ind w:left="960"/>
+        <w:rPr>
+          <w:noProof/>
+        </w:rPr>
+      </w:pPr>
+      <w:hyperlink w:anchor="_Toc228470854" w:history="1">
+        <w:r>
+          <w:rPr>
+            <w:rStyle w:val="af"/>
+            <w:noProof/>
+          </w:rPr>
+          <w:t>3.1 Raw Data Source</w:t>
+        </w:r>
+        <w:r>
+          <w:rPr>
+            <w:noProof/>
+            <w:webHidden/>
+          </w:rPr>
+          <w:tab/>
+        </w:r>
+        <w:r>
+          <w:rPr>
+            <w:noProof/>
+            <w:webHidden/>
+          </w:rPr>
+          <w:fldChar w:fldCharType="begin"/>
+        </w:r>
+        <w:r>
+          <w:rPr>
+            <w:noProof/>
+            <w:webHidden/>
+          </w:rPr>
+          <w:instrText xml:space="preserve"> PAGEREF _Toc228470854 \h </w:instrText>
+        </w:r>
+        <w:r>
+          <w:rPr>
+            <w:noProof/>
+            <w:webHidden/>
+          </w:rPr>
+        </w:r>
+        <w:r>
+          <w:rPr>
+            <w:noProof/>
+            <w:webHidden/>
+          </w:rPr>
+          <w:fldChar w:fldCharType="separate"/>
+        </w:r>
+        <w:r>
+          <w:rPr>
+            <w:noProof/>
+            <w:webHidden/>
+          </w:rPr>
+          <w:t>4</w:t>
+        </w:r>
+        <w:r>
+          <w:rPr>
+            <w:noProof/>
+            <w:webHidden/>
+          </w:rPr>
+          <w:fldChar w:fldCharType="end"/>
+        </w:r>
+      </w:hyperlink>
+    </w:p>
+    <w:p>
+      <w:pPr>
+        <w:pStyle w:val="TOC3"/>
+        <w:tabs>
+          <w:tab w:val="right" w:leader="dot" w:pos="8630"/>
+        </w:tabs>
+        <w:ind w:left="960"/>
+        <w:rPr>
+          <w:noProof/>
+        </w:rPr>
+      </w:pPr>
+      <w:hyperlink w:anchor="_Toc228470855" w:history="1">
+        <w:r>
+          <w:rPr>
+            <w:rStyle w:val="af"/>
+            <w:noProof/>
+          </w:rPr>
+          <w:t>3.2 Review-Value Dataset</w:t>
+        </w:r>
+        <w:r>
+          <w:rPr>
+            <w:noProof/>
+            <w:webHidden/>
+          </w:rPr>
+          <w:tab/>
+        </w:r>
+        <w:r>
+          <w:rPr>
+            <w:noProof/>
+            <w:webHidden/>
+          </w:rPr>
+          <w:fldChar w:fldCharType="begin"/>
+        </w:r>
+        <w:r>
+          <w:rPr>
+            <w:noProof/>
+            <w:webHidden/>
+          </w:rPr>
+          <w:instrText xml:space="preserve"> PAGEREF _Toc228470855 \h </w:instrText>
+        </w:r>
+        <w:r>
+          <w:rPr>
+            <w:noProof/>
+            <w:webHidden/>
+          </w:rPr>
+        </w:r>
+        <w:r>
+          <w:rPr>
+            <w:noProof/>
+            <w:webHidden/>
+          </w:rPr>
+          <w:fldChar w:fldCharType="separate"/>
+        </w:r>
+        <w:r>
+          <w:rPr>
+            <w:noProof/>
+            <w:webHidden/>
+          </w:rPr>
+          <w:t>5</w:t>
+        </w:r>
+        <w:r>
+          <w:rPr>
+            <w:noProof/>
+            <w:webHidden/>
+          </w:rPr>
+          <w:fldChar w:fldCharType="end"/>
+        </w:r>
+      </w:hyperlink>
+    </w:p>
+    <w:p>
+      <w:pPr>
+        <w:pStyle w:val="TOC3"/>
+        <w:tabs>
+          <w:tab w:val="right" w:leader="dot" w:pos="8630"/>
+        </w:tabs>
+        <w:ind w:left="960"/>
+        <w:rPr>
+          <w:noProof/>
+        </w:rPr>
+      </w:pPr>
+      <w:hyperlink w:anchor="_Toc228470856" w:history="1">
+        <w:r>
+          <w:rPr>
+            <w:rStyle w:val="af"/>
+            <w:noProof/>
+          </w:rPr>
+          <w:t>3.3 Calibrated Sentiment Dataset</w:t>
+        </w:r>
+        <w:r>
+          <w:rPr>
+            <w:noProof/>
+            <w:webHidden/>
+          </w:rPr>
+          <w:tab/>
+        </w:r>
+        <w:r>
+          <w:rPr>
+            <w:noProof/>
+            <w:webHidden/>
+          </w:rPr>
+          <w:fldChar w:fldCharType="begin"/>
+        </w:r>
+        <w:r>
+          <w:rPr>
+            <w:noProof/>
+            <w:webHidden/>
+          </w:rPr>
+          <w:instrText xml:space="preserve"> PAGEREF _Toc228470856 \h </w:instrText>
+        </w:r>
+        <w:r>
+          <w:rPr>
+            <w:noProof/>
+            <w:webHidden/>
+          </w:rPr>
+        </w:r>
+        <w:r>
+          <w:rPr>
+            <w:noProof/>
+            <w:webHidden/>
+          </w:rPr>
+          <w:fldChar w:fldCharType="separate"/>
+        </w:r>
+        <w:r>
+          <w:rPr>
+            <w:noProof/>
+            <w:webHidden/>
+          </w:rPr>
+          <w:t>5</w:t>
+        </w:r>
+        <w:r>
+          <w:rPr>
+            <w:noProof/>
+            <w:webHidden/>
+          </w:rPr>
+          <w:fldChar w:fldCharType="end"/>
+        </w:r>
+      </w:hyperlink>
+    </w:p>
+    <w:p>
+      <w:pPr>
+        <w:pStyle w:val="TOC3"/>
+        <w:tabs>
+          <w:tab w:val="right" w:leader="dot" w:pos="8630"/>
+        </w:tabs>
+        <w:ind w:left="960"/>
+        <w:rPr>
+          <w:noProof/>
+        </w:rPr>
+      </w:pPr>
+      <w:hyperlink w:anchor="_Toc228470857" w:history="1">
+        <w:r>
+          <w:rPr>
+            <w:rStyle w:val="af"/>
+            <w:noProof/>
+          </w:rPr>
+          <w:t>3.4 Pseudo Complaint-Title Dataset</w:t>
+        </w:r>
+        <w:r>
+          <w:rPr>
+            <w:noProof/>
+            <w:webHidden/>
+          </w:rPr>
+          <w:tab/>
+        </w:r>
+        <w:r>
+          <w:rPr>
+            <w:noProof/>
+            <w:webHidden/>
+          </w:rPr>
+          <w:fldChar w:fldCharType="begin"/>
+        </w:r>
+        <w:r>
+          <w:rPr>
+            <w:noProof/>
+            <w:webHidden/>
+          </w:rPr>
+          <w:instrText xml:space="preserve"> PAGEREF _Toc228470857 \h </w:instrText>
+        </w:r>
+        <w:r>
+          <w:rPr>
+            <w:noProof/>
+            <w:webHidden/>
+          </w:rPr>
+        </w:r>
+        <w:r>
+          <w:rPr>
+            <w:noProof/>
+            <w:webHidden/>
+          </w:rPr>
+          <w:fldChar w:fldCharType="separate"/>
+        </w:r>
+        <w:r>
+          <w:rPr>
+            <w:noProof/>
+            <w:webHidden/>
+          </w:rPr>
+          <w:t>6</w:t>
+        </w:r>
+        <w:r>
+          <w:rPr>
+            <w:noProof/>
+            <w:webHidden/>
+          </w:rPr>
+          <w:fldChar w:fldCharType="end"/>
+        </w:r>
+      </w:hyperlink>
+    </w:p>
+    <w:p>
+      <w:pPr>
+        <w:pStyle w:val="TOC3"/>
+        <w:tabs>
+          <w:tab w:val="right" w:leader="dot" w:pos="8630"/>
+        </w:tabs>
+        <w:ind w:left="960"/>
+        <w:rPr>
+          <w:noProof/>
+        </w:rPr>
+      </w:pPr>
+      <w:hyperlink w:anchor="_Toc228470858" w:history="1">
+        <w:r>
+          <w:rPr>
+            <w:rStyle w:val="af"/>
+            <w:noProof/>
+          </w:rPr>
+          <w:t>3.5 Dashboard Display Data</w:t>
+        </w:r>
+        <w:r>
+          <w:rPr>
+            <w:noProof/>
+            <w:webHidden/>
+          </w:rPr>
+          <w:tab/>
+        </w:r>
+        <w:r>
+          <w:rPr>
+            <w:noProof/>
+            <w:webHidden/>
+          </w:rPr>
+          <w:fldChar w:fldCharType="begin"/>
+        </w:r>
+        <w:r>
+          <w:rPr>
+            <w:noProof/>
+            <w:webHidden/>
+          </w:rPr>
+          <w:instrText xml:space="preserve"> PAGEREF _Toc228470858 \h </w:instrText>
+        </w:r>
+        <w:r>
+          <w:rPr>
+            <w:noProof/>
+            <w:webHidden/>
+          </w:rPr>
+        </w:r>
+        <w:r>
+          <w:rPr>
+            <w:noProof/>
+            <w:webHidden/>
+          </w:rPr>
+          <w:fldChar w:fldCharType="separate"/>
+        </w:r>
+        <w:r>
+          <w:rPr>
+            <w:noProof/>
+            <w:webHidden/>
+          </w:rPr>
+          <w:t>7</w:t>
+        </w:r>
+        <w:r>
+          <w:rPr>
+            <w:noProof/>
+            <w:webHidden/>
+          </w:rPr>
+          <w:fldChar w:fldCharType="end"/>
+        </w:r>
+      </w:hyperlink>
+    </w:p>
+    <w:p>
+      <w:pPr>
+        <w:pStyle w:val="TOC2"/>
+        <w:tabs>
+          <w:tab w:val="right" w:leader="dot" w:pos="8630"/>
+        </w:tabs>
+        <w:ind w:left="480"/>
+        <w:rPr>
+          <w:noProof/>
+        </w:rPr>
+      </w:pPr>
+      <w:hyperlink w:anchor="_Toc228470859" w:history="1">
+        <w:r>
+          <w:rPr>
+            <w:rStyle w:val="af"/>
+            <w:noProof/>
+          </w:rPr>
+          <w:t>4. System Design and Solution Approach</w:t>
+        </w:r>
+        <w:r>
+          <w:rPr>
+            <w:noProof/>
+            <w:webHidden/>
+          </w:rPr>
+          <w:tab/>
+        </w:r>
+        <w:r>
+          <w:rPr>
+            <w:noProof/>
+            <w:webHidden/>
+          </w:rPr>
+          <w:fldChar w:fldCharType="begin"/>
+        </w:r>
+        <w:r>
+          <w:rPr>
+            <w:noProof/>
+            <w:webHidden/>
+          </w:rPr>
+          <w:instrText xml:space="preserve"> PAGEREF _Toc228470859 \h </w:instrText>
+        </w:r>
+        <w:r>
+          <w:rPr>
+            <w:noProof/>
+            <w:webHidden/>
+          </w:rPr>
+        </w:r>
+        <w:r>
+          <w:rPr>
+            <w:noProof/>
+            <w:webHidden/>
+          </w:rPr>
+          <w:fldChar w:fldCharType="separate"/>
+        </w:r>
+        <w:r>
+          <w:rPr>
+            <w:noProof/>
+            <w:webHidden/>
+          </w:rPr>
+          <w:t>7</w:t>
+        </w:r>
+        <w:r>
+          <w:rPr>
+            <w:noProof/>
+            <w:webHidden/>
+          </w:rPr>
+          <w:fldChar w:fldCharType="end"/>
+        </w:r>
+      </w:hyperlink>
+    </w:p>
+    <w:p>
+      <w:pPr>
+        <w:pStyle w:val="TOC3"/>
+        <w:tabs>
+          <w:tab w:val="right" w:leader="dot" w:pos="8630"/>
+        </w:tabs>
+        <w:ind w:left="960"/>
+        <w:rPr>
+          <w:noProof/>
+        </w:rPr>
+      </w:pPr>
+      <w:hyperlink w:anchor="_Toc228470860" w:history="1">
+        <w:r>
+          <w:rPr>
+            <w:rStyle w:val="af"/>
+            <w:noProof/>
+          </w:rPr>
+          <w:t>4.1 Overall Architecture</w:t>
+        </w:r>
+        <w:r>
+          <w:rPr>
+            <w:noProof/>
+            <w:webHidden/>
+          </w:rPr>
+          <w:tab/>
+        </w:r>
+        <w:r>
+          <w:rPr>
+            <w:noProof/>
+            <w:webHidden/>
+          </w:rPr>
+          <w:fldChar w:fldCharType="begin"/>
+        </w:r>
+        <w:r>
+          <w:rPr>
+            <w:noProof/>
+            <w:webHidden/>
+          </w:rPr>
+          <w:instrText xml:space="preserve"> PAGEREF _Toc228470860 \h </w:instrText>
+        </w:r>
+        <w:r>
+          <w:rPr>
+            <w:noProof/>
+            <w:webHidden/>
+          </w:rPr>
+        </w:r>
+        <w:r>
+          <w:rPr>
+            <w:noProof/>
+            <w:webHidden/>
+          </w:rPr>
+          <w:fldChar w:fldCharType="separate"/>
+        </w:r>
+        <w:r>
+          <w:rPr>
+            <w:noProof/>
+            <w:webHidden/>
+          </w:rPr>
+          <w:t>7</w:t>
+        </w:r>
+        <w:r>
+          <w:rPr>
+            <w:noProof/>
+            <w:webHidden/>
+          </w:rPr>
+          <w:fldChar w:fldCharType="end"/>
+        </w:r>
+      </w:hyperlink>
+    </w:p>
+    <w:p>
+      <w:pPr>
+        <w:pStyle w:val="TOC3"/>
+        <w:tabs>
+          <w:tab w:val="right" w:leader="dot" w:pos="8630"/>
+        </w:tabs>
+        <w:ind w:left="960"/>
+        <w:rPr>
+          <w:noProof/>
+        </w:rPr>
+      </w:pPr>
+      <w:hyperlink w:anchor="_Toc228470861" w:history="1">
+        <w:r>
+          <w:rPr>
+            <w:rStyle w:val="af"/>
+            <w:noProof/>
+          </w:rPr>
+          <w:t>4.2 Text Cleaning and Preprocessing</w:t>
+        </w:r>
+        <w:r>
+          <w:rPr>
+            <w:noProof/>
+            <w:webHidden/>
+          </w:rPr>
+          <w:tab/>
+        </w:r>
+        <w:r>
+          <w:rPr>
+            <w:noProof/>
+            <w:webHidden/>
+          </w:rPr>
+          <w:fldChar w:fldCharType="begin"/>
+        </w:r>
+        <w:r>
+          <w:rPr>
+            <w:noProof/>
+            <w:webHidden/>
+          </w:rPr>
+          <w:instrText xml:space="preserve"> PAGEREF _Toc228470861 \h </w:instrText>
+        </w:r>
+        <w:r>
+          <w:rPr>
+            <w:noProof/>
+            <w:webHidden/>
+          </w:rPr>
+        </w:r>
+        <w:r>
+          <w:rPr>
+            <w:noProof/>
+            <w:webHidden/>
+          </w:rPr>
+          <w:fldChar w:fldCharType="separate"/>
+        </w:r>
+        <w:r>
+          <w:rPr>
+            <w:noProof/>
+            <w:webHidden/>
+          </w:rPr>
+          <w:t>8</w:t>
+        </w:r>
+        <w:r>
+          <w:rPr>
+            <w:noProof/>
+            <w:webHidden/>
+          </w:rPr>
+          <w:fldChar w:fldCharType="end"/>
+        </w:r>
+      </w:hyperlink>
+    </w:p>
+    <w:p>
+      <w:pPr>
+        <w:pStyle w:val="TOC3"/>
+        <w:tabs>
+          <w:tab w:val="right" w:leader="dot" w:pos="8630"/>
+        </w:tabs>
+        <w:ind w:left="960"/>
+        <w:rPr>
+          <w:noProof/>
+        </w:rPr>
+      </w:pPr>
+      <w:hyperlink w:anchor="_Toc228470862" w:history="1">
+        <w:r>
+          <w:rPr>
+            <w:rStyle w:val="af"/>
+            <w:noProof/>
+          </w:rPr>
+          <w:t>4.3 Review-Value Classification</w:t>
+        </w:r>
+        <w:r>
+          <w:rPr>
+            <w:noProof/>
+            <w:webHidden/>
+          </w:rPr>
+          <w:tab/>
+        </w:r>
+        <w:r>
+          <w:rPr>
+            <w:noProof/>
+            <w:webHidden/>
+          </w:rPr>
+          <w:fldChar w:fldCharType="begin"/>
+        </w:r>
+        <w:r>
+          <w:rPr>
+            <w:noProof/>
+            <w:webHidden/>
+          </w:rPr>
+          <w:instrText xml:space="preserve"> PAGEREF _Toc228470862 \h </w:instrText>
+        </w:r>
+        <w:r>
+          <w:rPr>
+            <w:noProof/>
+            <w:webHidden/>
+          </w:rPr>
+        </w:r>
+        <w:r>
+          <w:rPr>
+            <w:noProof/>
+            <w:webHidden/>
+          </w:rPr>
+          <w:fldChar w:fldCharType="separate"/>
+        </w:r>
+        <w:r>
+          <w:rPr>
+            <w:noProof/>
+            <w:webHidden/>
+          </w:rPr>
+          <w:t>8</w:t>
+        </w:r>
+        <w:r>
+          <w:rPr>
+            <w:noProof/>
+            <w:webHidden/>
+          </w:rPr>
+          <w:fldChar w:fldCharType="end"/>
+        </w:r>
+      </w:hyperlink>
+    </w:p>
+    <w:p>
+      <w:pPr>
+        <w:pStyle w:val="TOC3"/>
+        <w:tabs>
+          <w:tab w:val="right" w:leader="dot" w:pos="8630"/>
+        </w:tabs>
+        <w:ind w:left="960"/>
+        <w:rPr>
+          <w:noProof/>
+        </w:rPr>
+      </w:pPr>
+      <w:hyperlink w:anchor="_Toc228470863" w:history="1">
+        <w:r>
+          <w:rPr>
+            <w:rStyle w:val="af"/>
+            <w:noProof/>
+          </w:rPr>
+          <w:t>4.4 Sentiment Mining</w:t>
+        </w:r>
+        <w:r>
+          <w:rPr>
+            <w:noProof/>
+            <w:webHidden/>
+          </w:rPr>
+          <w:tab/>
+        </w:r>
+        <w:r>
+          <w:rPr>
+            <w:noProof/>
+            <w:webHidden/>
+          </w:rPr>
+          <w:fldChar w:fldCharType="begin"/>
+        </w:r>
+        <w:r>
+          <w:rPr>
+            <w:noProof/>
+            <w:webHidden/>
+          </w:rPr>
+          <w:instrText xml:space="preserve"> PAGEREF _Toc228470863 \h </w:instrText>
+        </w:r>
+        <w:r>
+          <w:rPr>
+            <w:noProof/>
+            <w:webHidden/>
+          </w:rPr>
+        </w:r>
+        <w:r>
+          <w:rPr>
+            <w:noProof/>
+            <w:webHidden/>
+          </w:rPr>
+          <w:fldChar w:fldCharType="separate"/>
+        </w:r>
+        <w:r>
+          <w:rPr>
+            <w:noProof/>
+            <w:webHidden/>
+          </w:rPr>
+          <w:t>9</w:t>
+        </w:r>
+        <w:r>
+          <w:rPr>
+            <w:noProof/>
+            <w:webHidden/>
+          </w:rPr>
+          <w:fldChar w:fldCharType="end"/>
+        </w:r>
+      </w:hyperlink>
+    </w:p>
+    <w:p>
+      <w:pPr>
+        <w:pStyle w:val="TOC3"/>
+        <w:tabs>
+          <w:tab w:val="right" w:leader="dot" w:pos="8630"/>
+        </w:tabs>
+        <w:ind w:left="960"/>
+        <w:rPr>
+          <w:noProof/>
+        </w:rPr>
+      </w:pPr>
+      <w:hyperlink w:anchor="_Toc228470864" w:history="1">
+        <w:r>
+          <w:rPr>
+            <w:rStyle w:val="af"/>
+            <w:noProof/>
+          </w:rPr>
+          <w:t>4.5 Complaint-Title Generation</w:t>
+        </w:r>
+        <w:r>
+          <w:rPr>
+            <w:noProof/>
+            <w:webHidden/>
+          </w:rPr>
+          <w:tab/>
+        </w:r>
+        <w:r>
+          <w:rPr>
+            <w:noProof/>
+            <w:webHidden/>
+          </w:rPr>
+          <w:fldChar w:fldCharType="begin"/>
+        </w:r>
+        <w:r>
+          <w:rPr>
+            <w:noProof/>
+            <w:webHidden/>
+          </w:rPr>
+          <w:instrText xml:space="preserve"> PAGEREF _Toc228470864 \h </w:instrText>
+        </w:r>
+        <w:r>
+          <w:rPr>
+            <w:noProof/>
+            <w:webHidden/>
+          </w:rPr>
+        </w:r>
+        <w:r>
+          <w:rPr>
+            <w:noProof/>
+            <w:webHidden/>
+          </w:rPr>
+          <w:fldChar w:fldCharType="separate"/>
+        </w:r>
+        <w:r>
+          <w:rPr>
+            <w:noProof/>
+            <w:webHidden/>
+          </w:rPr>
+          <w:t>9</w:t>
+        </w:r>
+        <w:r>
+          <w:rPr>
+            <w:noProof/>
+            <w:webHidden/>
+          </w:rPr>
+          <w:fldChar w:fldCharType="end"/>
+        </w:r>
+      </w:hyperlink>
+    </w:p>
+    <w:p>
+      <w:pPr>
+        <w:pStyle w:val="TOC3"/>
+        <w:tabs>
+          <w:tab w:val="right" w:leader="dot" w:pos="8630"/>
+        </w:tabs>
+        <w:ind w:left="960"/>
+        <w:rPr>
+          <w:noProof/>
+        </w:rPr>
+      </w:pPr>
+      <w:hyperlink w:anchor="_Toc228470865" w:history="1">
+        <w:r>
+          <w:rPr>
+            <w:rStyle w:val="af"/>
+            <w:noProof/>
+          </w:rPr>
+          <w:t>4.6 Dashboard and Merchant Copilot</w:t>
+        </w:r>
+        <w:r>
+          <w:rPr>
+            <w:noProof/>
+            <w:webHidden/>
+          </w:rPr>
+          <w:tab/>
+        </w:r>
+        <w:r>
+          <w:rPr>
+            <w:noProof/>
+            <w:webHidden/>
+          </w:rPr>
+          <w:fldChar w:fldCharType="begin"/>
+        </w:r>
+        <w:r>
+          <w:rPr>
+            <w:noProof/>
+            <w:webHidden/>
+          </w:rPr>
+          <w:instrText xml:space="preserve"> PAGEREF _Toc228470865 \h </w:instrText>
+        </w:r>
+        <w:r>
+          <w:rPr>
+            <w:noProof/>
+            <w:webHidden/>
+          </w:rPr>
+        </w:r>
+        <w:r>
+          <w:rPr>
+            <w:noProof/>
+            <w:webHidden/>
+          </w:rPr>
+          <w:fldChar w:fldCharType="separate"/>
+        </w:r>
+        <w:r>
+          <w:rPr>
+            <w:noProof/>
+            <w:webHidden/>
+          </w:rPr>
+          <w:t>11</w:t>
+        </w:r>
+        <w:r>
+          <w:rPr>
+            <w:noProof/>
+            <w:webHidden/>
+          </w:rPr>
+          <w:fldChar w:fldCharType="end"/>
+        </w:r>
+      </w:hyperlink>
+    </w:p>
+    <w:p>
+      <w:pPr>
+        <w:pStyle w:val="TOC2"/>
+        <w:tabs>
+          <w:tab w:val="right" w:leader="dot" w:pos="8630"/>
+        </w:tabs>
+        <w:ind w:left="480"/>
+        <w:rPr>
+          <w:noProof/>
+        </w:rPr>
+      </w:pPr>
+      <w:hyperlink w:anchor="_Toc228470866" w:history="1">
+        <w:r>
+          <w:rPr>
+            <w:rStyle w:val="af"/>
+            <w:noProof/>
+          </w:rPr>
+          <w:t>5. Evaluation and Test Results</w:t>
+        </w:r>
+        <w:r>
+          <w:rPr>
+            <w:noProof/>
+            <w:webHidden/>
+          </w:rPr>
+          <w:tab/>
+        </w:r>
+        <w:r>
+          <w:rPr>
+            <w:noProof/>
+            <w:webHidden/>
+          </w:rPr>
+          <w:fldChar w:fldCharType="begin"/>
+        </w:r>
+        <w:r>
+          <w:rPr>
+            <w:noProof/>
+            <w:webHidden/>
+          </w:rPr>
+          <w:instrText xml:space="preserve"> PAGEREF _Toc228470866 \h </w:instrText>
+        </w:r>
+        <w:r>
+          <w:rPr>
+            <w:noProof/>
+            <w:webHidden/>
+          </w:rPr>
+        </w:r>
+        <w:r>
+          <w:rPr>
+            <w:noProof/>
+            <w:webHidden/>
+          </w:rPr>
+          <w:fldChar w:fldCharType="separate"/>
+        </w:r>
+        <w:r>
+          <w:rPr>
+            <w:noProof/>
+            <w:webHidden/>
+          </w:rPr>
+          <w:t>13</w:t>
+        </w:r>
+        <w:r>
+          <w:rPr>
+            <w:noProof/>
+            <w:webHidden/>
+          </w:rPr>
+          <w:fldChar w:fldCharType="end"/>
+        </w:r>
+      </w:hyperlink>
+    </w:p>
+    <w:p>
+      <w:pPr>
+        <w:pStyle w:val="TOC3"/>
+        <w:tabs>
+          <w:tab w:val="right" w:leader="dot" w:pos="8630"/>
+        </w:tabs>
+        <w:ind w:left="960"/>
+        <w:rPr>
+          <w:noProof/>
+        </w:rPr>
+      </w:pPr>
+      <w:hyperlink w:anchor="_Toc228470867" w:history="1">
+        <w:r>
+          <w:rPr>
+            <w:rStyle w:val="af"/>
+            <w:noProof/>
+          </w:rPr>
+          <w:t>5.1 Evaluation Setup</w:t>
+        </w:r>
+        <w:r>
+          <w:rPr>
+            <w:noProof/>
+            <w:webHidden/>
+          </w:rPr>
+          <w:tab/>
+        </w:r>
+        <w:r>
+          <w:rPr>
+            <w:noProof/>
+            <w:webHidden/>
+          </w:rPr>
+          <w:fldChar w:fldCharType="begin"/>
+        </w:r>
+        <w:r>
+          <w:rPr>
+            <w:noProof/>
+            <w:webHidden/>
+          </w:rPr>
+          <w:instrText xml:space="preserve"> PAGEREF _Toc228470867 \h </w:instrText>
+        </w:r>
+        <w:r>
+          <w:rPr>
+            <w:noProof/>
+            <w:webHidden/>
+          </w:rPr>
+        </w:r>
+        <w:r>
+          <w:rPr>
+            <w:noProof/>
+            <w:webHidden/>
+          </w:rPr>
+          <w:fldChar w:fldCharType="separate"/>
+        </w:r>
+        <w:r>
+          <w:rPr>
+            <w:noProof/>
+            <w:webHidden/>
+          </w:rPr>
+          <w:t>13</w:t>
+        </w:r>
+        <w:r>
+          <w:rPr>
+            <w:noProof/>
+            <w:webHidden/>
+          </w:rPr>
+          <w:fldChar w:fldCharType="end"/>
+        </w:r>
+      </w:hyperlink>
+    </w:p>
+    <w:p>
+      <w:pPr>
+        <w:pStyle w:val="TOC3"/>
+        <w:tabs>
+          <w:tab w:val="right" w:leader="dot" w:pos="8630"/>
+        </w:tabs>
+        <w:ind w:left="960"/>
+        <w:rPr>
+          <w:noProof/>
+        </w:rPr>
+      </w:pPr>
+      <w:hyperlink w:anchor="_Toc228470868" w:history="1">
+        <w:r>
+          <w:rPr>
+            <w:rStyle w:val="af"/>
+            <w:noProof/>
+          </w:rPr>
+          <w:t>5.2 Review-Value Classification Results</w:t>
+        </w:r>
+        <w:r>
+          <w:rPr>
+            <w:noProof/>
+            <w:webHidden/>
+          </w:rPr>
+          <w:tab/>
+        </w:r>
+        <w:r>
+          <w:rPr>
+            <w:noProof/>
+            <w:webHidden/>
+          </w:rPr>
+          <w:fldChar w:fldCharType="begin"/>
+        </w:r>
+        <w:r>
+          <w:rPr>
+            <w:noProof/>
+            <w:webHidden/>
+          </w:rPr>
+          <w:instrText xml:space="preserve"> PAGEREF _Toc228470868 \h </w:instrText>
+        </w:r>
+        <w:r>
+          <w:rPr>
+            <w:noProof/>
+            <w:webHidden/>
+          </w:rPr>
+        </w:r>
+        <w:r>
+          <w:rPr>
+            <w:noProof/>
+            <w:webHidden/>
+          </w:rPr>
+          <w:fldChar w:fldCharType="separate"/>
+        </w:r>
+        <w:r>
+          <w:rPr>
+            <w:noProof/>
+            <w:webHidden/>
+          </w:rPr>
+          <w:t>13</w:t>
+        </w:r>
+        <w:r>
+          <w:rPr>
+            <w:noProof/>
+            <w:webHidden/>
+          </w:rPr>
+          <w:fldChar w:fldCharType="end"/>
+        </w:r>
+      </w:hyperlink>
+    </w:p>
+    <w:p>
+      <w:pPr>
+        <w:pStyle w:val="TOC3"/>
+        <w:tabs>
+          <w:tab w:val="right" w:leader="dot" w:pos="8630"/>
+        </w:tabs>
+        <w:ind w:left="960"/>
+        <w:rPr>
+          <w:noProof/>
+        </w:rPr>
+      </w:pPr>
+      <w:hyperlink w:anchor="_Toc228470869" w:history="1">
+        <w:r>
+          <w:rPr>
+            <w:rStyle w:val="af"/>
+            <w:noProof/>
+          </w:rPr>
+          <w:t>5.3 Sentiment Mining Results</w:t>
+        </w:r>
+        <w:r>
+          <w:rPr>
+            <w:noProof/>
+            <w:webHidden/>
+          </w:rPr>
+          <w:tab/>
+        </w:r>
+        <w:r>
+          <w:rPr>
+            <w:noProof/>
+            <w:webHidden/>
+          </w:rPr>
+          <w:fldChar w:fldCharType="begin"/>
+        </w:r>
+        <w:r>
+          <w:rPr>
+            <w:noProof/>
+            <w:webHidden/>
+          </w:rPr>
+          <w:instrText xml:space="preserve"> PAGEREF _Toc228470869 \h </w:instrText>
+        </w:r>
+        <w:r>
+          <w:rPr>
+            <w:noProof/>
+            <w:webHidden/>
+          </w:rPr>
+        </w:r>
+        <w:r>
+          <w:rPr>
+            <w:noProof/>
+            <w:webHidden/>
+          </w:rPr>
+          <w:fldChar w:fldCharType="separate"/>
+        </w:r>
+        <w:r>
+          <w:rPr>
+            <w:noProof/>
+            <w:webHidden/>
+          </w:rPr>
+          <w:t>13</w:t>
+        </w:r>
+        <w:r>
+          <w:rPr>
+            <w:noProof/>
+            <w:webHidden/>
+          </w:rPr>
+          <w:fldChar w:fldCharType="end"/>
+        </w:r>
+      </w:hyperlink>
+    </w:p>
+    <w:p>
+      <w:pPr>
+        <w:pStyle w:val="TOC3"/>
+        <w:tabs>
+          <w:tab w:val="right" w:leader="dot" w:pos="8630"/>
+        </w:tabs>
+        <w:ind w:left="960"/>
+        <w:rPr>
+          <w:noProof/>
+        </w:rPr>
+      </w:pPr>
+      <w:hyperlink w:anchor="_Toc228470870" w:history="1">
+        <w:r>
+          <w:rPr>
+            <w:rStyle w:val="af"/>
+            <w:noProof/>
+          </w:rPr>
+          <w:t>5.4 Complaint-Title Generation Results</w:t>
+        </w:r>
+        <w:r>
+          <w:rPr>
+            <w:noProof/>
+            <w:webHidden/>
+          </w:rPr>
+          <w:tab/>
+        </w:r>
+        <w:r>
+          <w:rPr>
+            <w:noProof/>
+            <w:webHidden/>
+          </w:rPr>
+          <w:fldChar w:fldCharType="begin"/>
+        </w:r>
+        <w:r>
+          <w:rPr>
+            <w:noProof/>
+            <w:webHidden/>
+          </w:rPr>
+          <w:instrText xml:space="preserve"> PAGEREF _Toc228470870 \h </w:instrText>
+        </w:r>
+        <w:r>
+          <w:rPr>
+            <w:noProof/>
+            <w:webHidden/>
+          </w:rPr>
+        </w:r>
+        <w:r>
+          <w:rPr>
+            <w:noProof/>
+            <w:webHidden/>
+          </w:rPr>
+          <w:fldChar w:fldCharType="separate"/>
+        </w:r>
+        <w:r>
+          <w:rPr>
+            <w:noProof/>
+            <w:webHidden/>
+          </w:rPr>
+          <w:t>14</w:t>
+        </w:r>
+        <w:r>
+          <w:rPr>
+            <w:noProof/>
+            <w:webHidden/>
+          </w:rPr>
+          <w:fldChar w:fldCharType="end"/>
+        </w:r>
+      </w:hyperlink>
+    </w:p>
+    <w:p>
+      <w:pPr>
+        <w:pStyle w:val="TOC3"/>
+        <w:tabs>
+          <w:tab w:val="right" w:leader="dot" w:pos="8630"/>
+        </w:tabs>
+        <w:ind w:left="960"/>
+        <w:rPr>
+          <w:noProof/>
+        </w:rPr>
+      </w:pPr>
+      <w:hyperlink w:anchor="_Toc228470871" w:history="1">
+        <w:r>
+          <w:rPr>
+            <w:rStyle w:val="af"/>
+            <w:noProof/>
+          </w:rPr>
+          <w:t>5.5 Qualitative Analysis</w:t>
+        </w:r>
+        <w:r>
+          <w:rPr>
+            <w:noProof/>
+            <w:webHidden/>
+          </w:rPr>
+          <w:tab/>
+        </w:r>
+        <w:r>
+          <w:rPr>
+            <w:noProof/>
+            <w:webHidden/>
+          </w:rPr>
+          <w:fldChar w:fldCharType="begin"/>
+        </w:r>
+        <w:r>
+          <w:rPr>
+            <w:noProof/>
+            <w:webHidden/>
+          </w:rPr>
+          <w:instrText xml:space="preserve"> PAGEREF _Toc228470871 \h </w:instrText>
+        </w:r>
+        <w:r>
+          <w:rPr>
+            <w:noProof/>
+            <w:webHidden/>
+          </w:rPr>
+        </w:r>
+        <w:r>
+          <w:rPr>
+            <w:noProof/>
+            <w:webHidden/>
+          </w:rPr>
+          <w:fldChar w:fldCharType="separate"/>
+        </w:r>
+        <w:r>
+          <w:rPr>
+            <w:noProof/>
+            <w:webHidden/>
+          </w:rPr>
+          <w:t>14</w:t>
+        </w:r>
+        <w:r>
+          <w:rPr>
+            <w:noProof/>
+            <w:webHidden/>
+          </w:rPr>
+          <w:fldChar w:fldCharType="end"/>
+        </w:r>
+      </w:hyperlink>
+    </w:p>
+    <w:p>
+      <w:pPr>
+        <w:pStyle w:val="TOC2"/>
+        <w:tabs>
+          <w:tab w:val="right" w:leader="dot" w:pos="8630"/>
+        </w:tabs>
+        <w:ind w:left="480"/>
+        <w:rPr>
+          <w:noProof/>
+        </w:rPr>
+      </w:pPr>
+      <w:hyperlink w:anchor="_Toc228470872" w:history="1">
+        <w:r>
+          <w:rPr>
+            <w:rStyle w:val="af"/>
+            <w:noProof/>
+          </w:rPr>
+          <w:t>6. Limitations and Future Work</w:t>
+        </w:r>
+        <w:r>
+          <w:rPr>
+            <w:noProof/>
+            <w:webHidden/>
+          </w:rPr>
+          <w:tab/>
+        </w:r>
+        <w:r>
+          <w:rPr>
+            <w:noProof/>
+            <w:webHidden/>
+          </w:rPr>
+          <w:fldChar w:fldCharType="begin"/>
+        </w:r>
+        <w:r>
+          <w:rPr>
+            <w:noProof/>
+            <w:webHidden/>
+          </w:rPr>
+          <w:instrText xml:space="preserve"> PAGEREF _Toc228470872 \h </w:instrText>
+        </w:r>
+        <w:r>
+          <w:rPr>
+            <w:noProof/>
+            <w:webHidden/>
+          </w:rPr>
+        </w:r>
+        <w:r>
+          <w:rPr>
+            <w:noProof/>
+            <w:webHidden/>
+          </w:rPr>
+          <w:fldChar w:fldCharType="separate"/>
+        </w:r>
+        <w:r>
+          <w:rPr>
+            <w:noProof/>
+            <w:webHidden/>
+          </w:rPr>
+          <w:t>15</w:t>
+        </w:r>
+        <w:r>
+          <w:rPr>
+            <w:noProof/>
+            <w:webHidden/>
+          </w:rPr>
+          <w:fldChar w:fldCharType="end"/>
+        </w:r>
+      </w:hyperlink>
+    </w:p>
+    <w:p>
+      <w:pPr>
+        <w:pStyle w:val="TOC2"/>
+        <w:tabs>
+          <w:tab w:val="right" w:leader="dot" w:pos="8630"/>
+        </w:tabs>
+        <w:ind w:left="480"/>
+        <w:rPr>
+          <w:noProof/>
+        </w:rPr>
+      </w:pPr>
+      <w:hyperlink w:anchor="_Toc228470873" w:history="1">
+        <w:r>
+          <w:rPr>
+            <w:rStyle w:val="af"/>
+            <w:noProof/>
+          </w:rPr>
+          <w:t>7. Conclusion</w:t>
+        </w:r>
+        <w:r>
+          <w:rPr>
+            <w:noProof/>
+            <w:webHidden/>
+          </w:rPr>
+          <w:tab/>
+        </w:r>
+        <w:r>
+          <w:rPr>
+            <w:noProof/>
+            <w:webHidden/>
+          </w:rPr>
+          <w:fldChar w:fldCharType="begin"/>
+        </w:r>
+        <w:r>
+          <w:rPr>
+            <w:noProof/>
+            <w:webHidden/>
+          </w:rPr>
+          <w:instrText xml:space="preserve"> PAGEREF _Toc228470873 \h </w:instrText>
+        </w:r>
+        <w:r>
+          <w:rPr>
+            <w:noProof/>
+            <w:webHidden/>
+          </w:rPr>
+        </w:r>
+        <w:r>
+          <w:rPr>
+            <w:noProof/>
+            <w:webHidden/>
+          </w:rPr>
+          <w:fldChar w:fldCharType="separate"/>
+        </w:r>
+        <w:r>
+          <w:rPr>
+            <w:noProof/>
+            <w:webHidden/>
+          </w:rPr>
+          <w:t>16</w:t>
+        </w:r>
+        <w:r>
+          <w:rPr>
+            <w:noProof/>
+            <w:webHidden/>
+          </w:rPr>
+          <w:fldChar w:fldCharType="end"/>
+        </w:r>
+      </w:hyperlink>
+    </w:p>
+    <w:p>
+      <w:pPr>
+        <w:pStyle w:val="TOC2"/>
+        <w:tabs>
+          <w:tab w:val="right" w:leader="dot" w:pos="8630"/>
+        </w:tabs>
+        <w:ind w:left="480"/>
+        <w:rPr>
+          <w:noProof/>
+        </w:rPr>
+      </w:pPr>
+      <w:hyperlink w:anchor="_Toc228470874" w:history="1">
+        <w:r>
+          <w:rPr>
+            <w:rStyle w:val="af"/>
+            <w:noProof/>
+          </w:rPr>
+          <w:t>8. References</w:t>
+        </w:r>
+        <w:r>
+          <w:rPr>
+            <w:noProof/>
+            <w:webHidden/>
+          </w:rPr>
+          <w:tab/>
+        </w:r>
+        <w:r>
+          <w:rPr>
+            <w:noProof/>
+            <w:webHidden/>
+          </w:rPr>
+          <w:fldChar w:fldCharType="begin"/>
+        </w:r>
+        <w:r>
+          <w:rPr>
+            <w:noProof/>
+            <w:webHidden/>
+          </w:rPr>
+          <w:instrText xml:space="preserve"> PAGEREF _Toc228470874 \h </w:instrText>
+        </w:r>
+        <w:r>
+          <w:rPr>
+            <w:noProof/>
+            <w:webHidden/>
+          </w:rPr>
+        </w:r>
+        <w:r>
+          <w:rPr>
+            <w:noProof/>
+            <w:webHidden/>
+          </w:rPr>
+          <w:fldChar w:fldCharType="separate"/>
+        </w:r>
+        <w:r>
+          <w:rPr>
+            <w:noProof/>
+            <w:webHidden/>
+          </w:rPr>
+          <w:t>16</w:t>
+        </w:r>
+        <w:r>
+          <w:rPr>
+            <w:noProof/>
+            <w:webHidden/>
+          </w:rPr>
+          <w:fldChar w:fldCharType="end"/>
+        </w:r>
+      </w:hyperlink>
+    </w:p>
+    <w:p>
+      <w:pPr>
+        <w:pStyle w:val="TOC3"/>
+        <w:tabs>
+          <w:tab w:val="right" w:leader="dot" w:pos="8630"/>
+        </w:tabs>
+        <w:ind w:left="960"/>
+        <w:rPr>
+          <w:noProof/>
+        </w:rPr>
+      </w:pPr>
+      <w:hyperlink w:anchor="_Toc228470875" w:history="1">
+        <w:r>
+          <w:rPr>
+            <w:rStyle w:val="af"/>
+            <w:noProof/>
+          </w:rPr>
+          <w:t>8.1 Dataset</w:t>
+        </w:r>
+        <w:r>
+          <w:rPr>
+            <w:noProof/>
+            <w:webHidden/>
+          </w:rPr>
+          <w:tab/>
+        </w:r>
+        <w:r>
+          <w:rPr>
+            <w:noProof/>
+            <w:webHidden/>
+          </w:rPr>
+          <w:fldChar w:fldCharType="begin"/>
+        </w:r>
+        <w:r>
+          <w:rPr>
+            <w:noProof/>
+            <w:webHidden/>
+          </w:rPr>
+          <w:instrText xml:space="preserve"> PAGEREF _Toc228470875 \h </w:instrText>
+        </w:r>
+        <w:r>
+          <w:rPr>
+            <w:noProof/>
+            <w:webHidden/>
+          </w:rPr>
+        </w:r>
+        <w:r>
+          <w:rPr>
+            <w:noProof/>
+            <w:webHidden/>
+          </w:rPr>
+          <w:fldChar w:fldCharType="separate"/>
+        </w:r>
+        <w:r>
+          <w:rPr>
+            <w:noProof/>
+            <w:webHidden/>
+          </w:rPr>
+          <w:t>16</w:t>
+        </w:r>
+        <w:r>
+          <w:rPr>
+            <w:noProof/>
+            <w:webHidden/>
+          </w:rPr>
+          <w:fldChar w:fldCharType="end"/>
+        </w:r>
+      </w:hyperlink>
+    </w:p>
+    <w:p>
+      <w:pPr>
+        <w:pStyle w:val="TOC3"/>
+        <w:tabs>
+          <w:tab w:val="right" w:leader="dot" w:pos="8630"/>
+        </w:tabs>
+        <w:ind w:left="960"/>
+        <w:rPr>
+          <w:noProof/>
+        </w:rPr>
+      </w:pPr>
+      <w:hyperlink w:anchor="_Toc228470876" w:history="1">
+        <w:r>
+          <w:rPr>
+            <w:rStyle w:val="af"/>
+            <w:noProof/>
+          </w:rPr>
+          <w:t>8.2 Pre-trained Models</w:t>
+        </w:r>
+        <w:r>
+          <w:rPr>
+            <w:noProof/>
+            <w:webHidden/>
+          </w:rPr>
+          <w:tab/>
+        </w:r>
+        <w:r>
+          <w:rPr>
+            <w:noProof/>
+            <w:webHidden/>
+          </w:rPr>
+          <w:fldChar w:fldCharType="begin"/>
+        </w:r>
+        <w:r>
+          <w:rPr>
+            <w:noProof/>
+            <w:webHidden/>
+          </w:rPr>
+          <w:instrText xml:space="preserve"> PAGEREF _Toc228470876 \h </w:instrText>
+        </w:r>
+        <w:r>
+          <w:rPr>
+            <w:noProof/>
+            <w:webHidden/>
+          </w:rPr>
+        </w:r>
+        <w:r>
+          <w:rPr>
+            <w:noProof/>
+            <w:webHidden/>
+          </w:rPr>
+          <w:fldChar w:fldCharType="separate"/>
+        </w:r>
+        <w:r>
+          <w:rPr>
+            <w:noProof/>
+            <w:webHidden/>
+          </w:rPr>
+          <w:t>16</w:t>
+        </w:r>
+        <w:r>
+          <w:rPr>
+            <w:noProof/>
+            <w:webHidden/>
+          </w:rPr>
+          <w:fldChar w:fldCharType="end"/>
+        </w:r>
+      </w:hyperlink>
+    </w:p>
+    <w:p>
+      <w:pPr>
+        <w:pStyle w:val="TOC3"/>
+        <w:tabs>
+          <w:tab w:val="right" w:leader="dot" w:pos="8630"/>
+        </w:tabs>
+        <w:ind w:left="960"/>
+        <w:rPr>
+          <w:noProof/>
+        </w:rPr>
+      </w:pPr>
+      <w:hyperlink w:anchor="_Toc228470877" w:history="1">
+        <w:r>
+          <w:rPr>
+            <w:rStyle w:val="af"/>
+            <w:noProof/>
+          </w:rPr>
+          <w:t>8.3 Libraries and Tools</w:t>
+        </w:r>
+        <w:r>
+          <w:rPr>
+            <w:noProof/>
+            <w:webHidden/>
+          </w:rPr>
+          <w:tab/>
+        </w:r>
+        <w:r>
+          <w:rPr>
+            <w:noProof/>
+            <w:webHidden/>
+          </w:rPr>
+          <w:fldChar w:fldCharType="begin"/>
+        </w:r>
+        <w:r>
+          <w:rPr>
+            <w:noProof/>
+            <w:webHidden/>
+          </w:rPr>
+          <w:instrText xml:space="preserve"> PAGEREF _Toc228470877 \h </w:instrText>
+        </w:r>
+        <w:r>
+          <w:rPr>
+            <w:noProof/>
+            <w:webHidden/>
+          </w:rPr>
+        </w:r>
+        <w:r>
+          <w:rPr>
+            <w:noProof/>
+            <w:webHidden/>
+          </w:rPr>
+          <w:fldChar w:fldCharType="separate"/>
+        </w:r>
+        <w:r>
+          <w:rPr>
+            <w:noProof/>
+            <w:webHidden/>
+          </w:rPr>
+          <w:t>17</w:t>
+        </w:r>
+        <w:r>
+          <w:rPr>
+            <w:noProof/>
+            <w:webHidden/>
+          </w:rPr>
+          <w:fldChar w:fldCharType="end"/>
+        </w:r>
+      </w:hyperlink>
+    </w:p>
+    <w:p>
+      <w:pPr>
+        <w:pStyle w:val="TOC3"/>
+        <w:tabs>
+          <w:tab w:val="right" w:leader="dot" w:pos="8630"/>
+        </w:tabs>
+        <w:ind w:left="960"/>
+        <w:rPr>
+          <w:noProof/>
+        </w:rPr>
+      </w:pPr>
+      <w:hyperlink w:anchor="_Toc228470878" w:history="1">
+        <w:r>
+          <w:rPr>
+            <w:rStyle w:val="af"/>
+            <w:noProof/>
+          </w:rPr>
+          <w:t>8.4 Source Code</w:t>
+        </w:r>
+        <w:r>
+          <w:rPr>
+            <w:noProof/>
+            <w:webHidden/>
+          </w:rPr>
+          <w:tab/>
+        </w:r>
+        <w:r>
+          <w:rPr>
+            <w:noProof/>
+            <w:webHidden/>
+          </w:rPr>
+          <w:fldChar w:fldCharType="begin"/>
+        </w:r>
+        <w:r>
+          <w:rPr>
+            <w:noProof/>
+            <w:webHidden/>
+          </w:rPr>
+          <w:instrText xml:space="preserve"> PAGEREF _Toc228470878 \h </w:instrText>
+        </w:r>
+        <w:r>
+          <w:rPr>
+            <w:noProof/>
+            <w:webHidden/>
+          </w:rPr>
+        </w:r>
+        <w:r>
+          <w:rPr>
+            <w:noProof/>
+            <w:webHidden/>
+          </w:rPr>
+          <w:fldChar w:fldCharType="separate"/>
+        </w:r>
+        <w:r>
+          <w:rPr>
+            <w:noProof/>
+            <w:webHidden/>
+          </w:rPr>
+          <w:t>17</w:t>
+        </w:r>
+        <w:r>
+          <w:rPr>
+            <w:noProof/>
+            <w:webHidden/>
+          </w:rPr>
+          <w:fldChar w:fldCharType="end"/>
+        </w:r>
+      </w:hyperlink>
+    </w:p>
+    <w:p>
+      <w:pPr>
+        <w:pStyle w:val="TOC2"/>
+        <w:tabs>
+          <w:tab w:val="right" w:leader="dot" w:pos="8630"/>
+        </w:tabs>
+        <w:ind w:left="480"/>
+        <w:rPr>
+          <w:noProof/>
+        </w:rPr>
+      </w:pPr>
+      <w:hyperlink w:anchor="_Toc228470879" w:history="1">
+        <w:r>
+          <w:rPr>
+            <w:rStyle w:val="af"/>
+            <w:noProof/>
+          </w:rPr>
+          <w:t>9. Individual Contribution of Each Team Member in the Project</w:t>
+        </w:r>
+        <w:r>
+          <w:rPr>
+            <w:noProof/>
+            <w:webHidden/>
+          </w:rPr>
+          <w:tab/>
+        </w:r>
+        <w:r>
+          <w:rPr>
+            <w:noProof/>
+            <w:webHidden/>
+          </w:rPr>
+          <w:fldChar w:fldCharType="begin"/>
+        </w:r>
+        <w:r>
+          <w:rPr>
+            <w:noProof/>
+            <w:webHidden/>
+          </w:rPr>
+          <w:instrText xml:space="preserve"> PAGEREF _Toc228470879 \h </w:instrText>
+        </w:r>
+        <w:r>
+          <w:rPr>
+            <w:noProof/>
+            <w:webHidden/>
+          </w:rPr>
+        </w:r>
+        <w:r>
+          <w:rPr>
+            <w:noProof/>
+            <w:webHidden/>
+          </w:rPr>
+          <w:fldChar w:fldCharType="separate"/>
+        </w:r>
+        <w:r>
+          <w:rPr>
+            <w:noProof/>
+            <w:webHidden/>
+          </w:rPr>
+          <w:t>18</w:t>
+        </w:r>
+        <w:r>
+          <w:rPr>
+            <w:noProof/>
+            <w:webHidden/>
+          </w:rPr>
+          <w:fldChar w:fldCharType="end"/>
+        </w:r>
+      </w:hyperlink>
+    </w:p>
+    <w:p>
+      <w:pPr>
+        <w:pStyle w:val="TOC2"/>
+        <w:tabs>
+          <w:tab w:val="right" w:leader="dot" w:pos="8630"/>
+        </w:tabs>
+        <w:ind w:left="480"/>
+        <w:rPr>
+          <w:noProof/>
+        </w:rPr>
+      </w:pPr>
+      <w:hyperlink w:anchor="_Toc228470880" w:history="1">
+        <w:r>
+          <w:rPr>
+            <w:rStyle w:val="af"/>
+            <w:noProof/>
+          </w:rPr>
+          <w:t>10. Usage of GenAI / LLMs</w:t>
+        </w:r>
+        <w:r>
+          <w:rPr>
+            <w:noProof/>
+            <w:webHidden/>
+          </w:rPr>
+          <w:tab/>
+        </w:r>
+        <w:r>
+          <w:rPr>
+            <w:noProof/>
+            <w:webHidden/>
+          </w:rPr>
+          <w:fldChar w:fldCharType="begin"/>
+        </w:r>
+        <w:r>
+          <w:rPr>
+            <w:noProof/>
+            <w:webHidden/>
+          </w:rPr>
+          <w:instrText xml:space="preserve"> PAGEREF _Toc228470880 \h </w:instrText>
+        </w:r>
+        <w:r>
+          <w:rPr>
+            <w:noProof/>
+            <w:webHidden/>
+          </w:rPr>
+        </w:r>
+        <w:r>
+          <w:rPr>
+            <w:noProof/>
+            <w:webHidden/>
+          </w:rPr>
+          <w:fldChar w:fldCharType="separate"/>
+        </w:r>
+        <w:r>
+          <w:rPr>
+            <w:noProof/>
+            <w:webHidden/>
+          </w:rPr>
+          <w:t>18</w:t>
+        </w:r>
+        <w:r>
+          <w:rPr>
+            <w:noProof/>
+            <w:webHidden/>
+          </w:rPr>
+          <w:fldChar w:fldCharType="end"/>
+        </w:r>
+      </w:hyperlink>
+    </w:p>
+    <w:p>
+      <w:r>
+        <w:fldChar w:fldCharType="end"/>
+      </w:r>
+    </w:p>
+    <w:p>
+      <w:r>
+        <w:br w:type="page"/>
+      </w:r>
+    </w:p>
+    <w:p>
+      <w:pPr>
+        <w:pStyle w:val="2"/>
+      </w:pPr>
+      <w:bookmarkStart w:id="0" w:name="_Toc228470851"/>
+      <w:bookmarkStart w:id="1" w:name="introduction-and-business-problem"/>
+      <w:bookmarkStart w:id="2" w:name="X1c31e062a79e80478a4be28c6e642d1e48a8528"/>
+      <w:r>
+        <w:lastRenderedPageBreak/>
+        <w:t>1. Introduction and Business Problem</w:t>
+      </w:r>
+      <w:bookmarkEnd w:id="0"/>
+    </w:p>
+    <w:p>
+      <w:pPr>
         <w:pStyle w:val="FirstParagraph"/>
       </w:pPr>
       <w:r>
-        <w:rPr>
-          <w:i/>
-          <w:iCs/>
-        </w:rPr>
-        <w:t>A Practice Module Report for Practical Language Processing</w:t>
-      </w:r>
-    </w:p>
-    <w:p>
-      <w:pPr>
-        <w:pStyle w:val="2"/>
-      </w:pPr>
-      <w:bookmarkStart w:id="1" w:name="introduction-and-business-problem"/>
-      <w:r>
-        <w:t>1. Introduction and Business Problem</w:t>
-      </w:r>
-    </w:p>
-    <w:p>
-      <w:pPr>
-        <w:pStyle w:val="FirstParagraph"/>
-      </w:pPr>
-      <w:r>
-        <w:t>This project builds an end-to-end language processing system for e-commerce review analytics. The target users are online merchants or product operations analysts who need to identify useful reviews, detect negative customer experience, and summarise complaints into short actionable issue titles.</w:t>
+        <w:t xml:space="preserve">This project builds an end-to-end language processing system for e-commerce review analytics. The target users are online merchants or product operations analysts who need to identify useful reviews, detect negative customer experience, and </w:t>
+      </w:r>
+      <w:proofErr w:type="spellStart"/>
+      <w:r>
+        <w:t>summarise</w:t>
+      </w:r>
+      <w:proofErr w:type="spellEnd"/>
+      <w:r>
+        <w:t xml:space="preserve"> complaints into short actionable issue titles.</w:t>
       </w:r>
     </w:p>
     <w:p>
@@ -53,7 +2171,15 @@
         <w:pStyle w:val="a0"/>
       </w:pPr>
       <w:r>
-        <w:t>Customer reviews are one of the most important sources of business feedback in e-commerce. They contain direct evidence of product quality, delivery problems, customer satisfaction, usability issues, and recurring complaints. However, the information is written as unstructured natural language. A merchant may have thousands of reviews across multiple products, but it is not realistic to manually read every review, decide whether it is useful, detect its sentiment, and summarise its core issue.</w:t>
+        <w:t xml:space="preserve">Customer reviews are one of the most important sources of business feedback in e-commerce. They contain direct evidence of product quality, delivery problems, customer satisfaction, usability issues, and recurring complaints. However, the information is written as unstructured natural language. A merchant may have thousands of reviews across multiple products, but it is not realistic to manually read every review, decide whether it is useful, detect its sentiment, and </w:t>
+      </w:r>
+      <w:proofErr w:type="spellStart"/>
+      <w:r>
+        <w:t>summarise</w:t>
+      </w:r>
+      <w:proofErr w:type="spellEnd"/>
+      <w:r>
+        <w:t xml:space="preserve"> its core issue.</w:t>
       </w:r>
     </w:p>
     <w:p>
@@ -91,6 +2217,7 @@
           <w:numId w:val="2"/>
         </w:numPr>
       </w:pPr>
+      <w:proofErr w:type="spellStart"/>
       <w:r>
         <w:rPr>
           <w:b/>
@@ -98,6 +2225,7 @@
         </w:rPr>
         <w:t>Prioritise</w:t>
       </w:r>
+      <w:proofErr w:type="spellEnd"/>
       <w:r>
         <w:t>: identify reviews that are likely to contain useful business information.</w:t>
       </w:r>
@@ -129,6 +2257,7 @@
           <w:numId w:val="2"/>
         </w:numPr>
       </w:pPr>
+      <w:proofErr w:type="spellStart"/>
       <w:r>
         <w:rPr>
           <w:b/>
@@ -136,6 +2265,7 @@
         </w:rPr>
         <w:t>Summarise</w:t>
       </w:r>
+      <w:proofErr w:type="spellEnd"/>
       <w:r>
         <w:t>: generate concise complaint titles for negative reviews.</w:t>
       </w:r>
@@ -172,29 +2302,43 @@
         <w:pStyle w:val="a0"/>
       </w:pPr>
       <w:r>
-        <w:t>The final deliverable is a Python-based pipeline and a Streamlit dashboard. The dashboard supports category and product filtering, representative negative review inspection, single-review inference, merchant CSV upload analysis, and an API-</w:t>
-      </w:r>
-      <w:r>
-        <w:lastRenderedPageBreak/>
-        <w:t>enabled text-based Merchant Copilot. The main evaluated components are the review-value classifier, the sentiment classifier, and the complaint-title generator.</w:t>
+        <w:t xml:space="preserve">The final deliverable is a Python-based pipeline and a </w:t>
+      </w:r>
+      <w:proofErr w:type="spellStart"/>
+      <w:r>
+        <w:t>Streamlit</w:t>
+      </w:r>
+      <w:proofErr w:type="spellEnd"/>
+      <w:r>
+        <w:t xml:space="preserve"> dashboard. The dashboard supports category and product filtering, representative negative review inspection, single-review inference, merchant CSV upload analysis, and an API-enabled text-based Merchant Copilot. The main evaluated components are the review-value classifier, the sentiment classifier, and the complaint-title generator.</w:t>
       </w:r>
     </w:p>
     <w:p>
       <w:pPr>
         <w:pStyle w:val="2"/>
       </w:pPr>
-      <w:bookmarkStart w:id="2" w:name="X08578815b24b57a9d77eff50361ab399168c1cb"/>
+      <w:bookmarkStart w:id="3" w:name="_Toc228470852"/>
+      <w:bookmarkStart w:id="4" w:name="X08578815b24b57a9d77eff50361ab399168c1cb"/>
       <w:bookmarkEnd w:id="1"/>
       <w:r>
         <w:t>2. Alignment with Practice Module Requirements</w:t>
       </w:r>
+      <w:bookmarkEnd w:id="3"/>
     </w:p>
     <w:p>
       <w:pPr>
         <w:pStyle w:val="FirstParagraph"/>
       </w:pPr>
       <w:r>
-        <w:t>The table below summarises how the project satisfies the Practical Language Processing practice module requirements.</w:t>
+        <w:t xml:space="preserve">The table below </w:t>
+      </w:r>
+      <w:proofErr w:type="spellStart"/>
+      <w:r>
+        <w:t>summarises</w:t>
+      </w:r>
+      <w:proofErr w:type="spellEnd"/>
+      <w:r>
+        <w:t xml:space="preserve"> how the project satisfies the Practical Language Processing practice module requirements.</w:t>
       </w:r>
     </w:p>
     <w:tbl>
@@ -268,7 +2412,11 @@
               <w:pStyle w:val="Compact"/>
             </w:pPr>
             <w:r>
-              <w:t>E-commerce review intelligence for merchant decision support</w:t>
+              <w:t xml:space="preserve">E-commerce review intelligence for </w:t>
+            </w:r>
+            <w:r>
+              <w:lastRenderedPageBreak/>
+              <w:t>merchant decision support</w:t>
             </w:r>
           </w:p>
         </w:tc>
@@ -286,6 +2434,7 @@
               <w:pStyle w:val="Compact"/>
             </w:pPr>
             <w:r>
+              <w:lastRenderedPageBreak/>
               <w:t>Language data</w:t>
             </w:r>
           </w:p>
@@ -394,11 +2543,19 @@
             <w:r>
               <w:t xml:space="preserve">Fine-tuned </w:t>
             </w:r>
+            <w:proofErr w:type="spellStart"/>
             <w:r>
               <w:rPr>
                 <w:rStyle w:val="VerbatimChar"/>
               </w:rPr>
-              <w:t>bert-base-uncased</w:t>
+              <w:t>bert</w:t>
+            </w:r>
+            <w:proofErr w:type="spellEnd"/>
+            <w:r>
+              <w:rPr>
+                <w:rStyle w:val="VerbatimChar"/>
+              </w:rPr>
+              <w:t>-base-uncased</w:t>
             </w:r>
             <w:r>
               <w:t xml:space="preserve"> and fine-tuned </w:t>
@@ -438,8 +2595,21 @@
               <w:pStyle w:val="Compact"/>
             </w:pPr>
             <w:r>
-              <w:t>Python pipeline using scikit-learn, PyTorch, Hugging Face Transformers, and Streamlit</w:t>
-            </w:r>
+              <w:t xml:space="preserve">Python pipeline using scikit-learn, </w:t>
+            </w:r>
+            <w:proofErr w:type="spellStart"/>
+            <w:r>
+              <w:t>PyTorch</w:t>
+            </w:r>
+            <w:proofErr w:type="spellEnd"/>
+            <w:r>
+              <w:t xml:space="preserve">, Hugging Face Transformers, and </w:t>
+            </w:r>
+            <w:proofErr w:type="spellStart"/>
+            <w:r>
+              <w:t>Streamlit</w:t>
+            </w:r>
+            <w:proofErr w:type="spellEnd"/>
           </w:p>
         </w:tc>
       </w:tr>
@@ -468,8 +2638,13 @@
             <w:pPr>
               <w:pStyle w:val="Compact"/>
             </w:pPr>
-            <w:r>
-              <w:t>Streamlit dashboard, source code, processed datasets, model metrics, and documentation</w:t>
+            <w:proofErr w:type="spellStart"/>
+            <w:r>
+              <w:t>Streamlit</w:t>
+            </w:r>
+            <w:proofErr w:type="spellEnd"/>
+            <w:r>
+              <w:t xml:space="preserve"> dashboard, source code, processed datasets, model metrics, and documentation</w:t>
             </w:r>
           </w:p>
         </w:tc>
@@ -482,34 +2657,54 @@
       <w:r>
         <w:t xml:space="preserve">The deep neural network requirement is satisfied by fine-tuning </w:t>
       </w:r>
+      <w:proofErr w:type="spellStart"/>
       <w:r>
         <w:rPr>
           <w:rStyle w:val="VerbatimChar"/>
         </w:rPr>
-        <w:t>bert-base-uncased</w:t>
-      </w:r>
-      <w:r>
-        <w:t xml:space="preserve"> for sentiment classification and fine-tuning Flan-T5 models for complaint-title generation. The project also includes a conversational text interface. The Merchant Copilot can connect to an LLM API when an API key is configured, and it falls back to local rule-based responses when the API is unavailable. It is evaluated here as a system interface rather than as a separately benchmarked open-domain chatbot.</w:t>
+        <w:t>bert</w:t>
+      </w:r>
+      <w:proofErr w:type="spellEnd"/>
+      <w:r>
+        <w:rPr>
+          <w:rStyle w:val="VerbatimChar"/>
+        </w:rPr>
+        <w:t>-base-uncased</w:t>
+      </w:r>
+      <w:r>
+        <w:t xml:space="preserve"> for sentiment classification and fine-tuning Flan-T5 models for complaint-title generation. The project also includes a conversational text interface. The Merchant Copilot can connect to an LLM API when an API key is configured, and it falls back to local rule-based responses when the API is unavailable. It is evaluated here as a system interface rather than as a separately benchmarked </w:t>
+      </w:r>
+      <w:proofErr w:type="gramStart"/>
+      <w:r>
+        <w:t>open-domain</w:t>
+      </w:r>
+      <w:proofErr w:type="gramEnd"/>
+      <w:r>
+        <w:t xml:space="preserve"> chatbot.</w:t>
       </w:r>
     </w:p>
     <w:p>
       <w:pPr>
         <w:pStyle w:val="2"/>
       </w:pPr>
-      <w:bookmarkStart w:id="3" w:name="datasets"/>
-      <w:bookmarkEnd w:id="2"/>
+      <w:bookmarkStart w:id="5" w:name="_Toc228470853"/>
+      <w:bookmarkStart w:id="6" w:name="datasets"/>
+      <w:bookmarkEnd w:id="4"/>
       <w:r>
         <w:t>3. Datasets</w:t>
       </w:r>
+      <w:bookmarkEnd w:id="5"/>
     </w:p>
     <w:p>
       <w:pPr>
         <w:pStyle w:val="3"/>
       </w:pPr>
-      <w:bookmarkStart w:id="4" w:name="raw-data-source"/>
+      <w:bookmarkStart w:id="7" w:name="_Toc228470854"/>
+      <w:bookmarkStart w:id="8" w:name="raw-data-source"/>
       <w:r>
         <w:t>3.1 Raw Data Source</w:t>
       </w:r>
+      <w:bookmarkEnd w:id="7"/>
     </w:p>
     <w:p>
       <w:pPr>
@@ -555,7 +2750,6 @@
               <w:jc w:val="center"/>
             </w:pPr>
             <w:r>
-              <w:lastRenderedPageBreak/>
               <w:t>Category</w:t>
             </w:r>
           </w:p>
@@ -588,12 +2782,14 @@
               <w:pStyle w:val="Compact"/>
               <w:jc w:val="center"/>
             </w:pPr>
+            <w:proofErr w:type="spellStart"/>
             <w:r>
               <w:rPr>
                 <w:rStyle w:val="VerbatimChar"/>
               </w:rPr>
               <w:t>All_Beauty</w:t>
             </w:r>
+            <w:proofErr w:type="spellEnd"/>
           </w:p>
         </w:tc>
         <w:tc>
@@ -624,12 +2820,14 @@
               <w:pStyle w:val="Compact"/>
               <w:jc w:val="center"/>
             </w:pPr>
+            <w:proofErr w:type="spellStart"/>
             <w:r>
               <w:rPr>
                 <w:rStyle w:val="VerbatimChar"/>
               </w:rPr>
               <w:t>Amazon_Fashion</w:t>
             </w:r>
+            <w:proofErr w:type="spellEnd"/>
           </w:p>
         </w:tc>
         <w:tc>
@@ -696,12 +2894,14 @@
               <w:pStyle w:val="Compact"/>
               <w:jc w:val="center"/>
             </w:pPr>
+            <w:proofErr w:type="spellStart"/>
             <w:r>
               <w:rPr>
                 <w:rStyle w:val="VerbatimChar"/>
               </w:rPr>
               <w:t>Handmade_Products</w:t>
             </w:r>
+            <w:proofErr w:type="spellEnd"/>
           </w:p>
         </w:tc>
         <w:tc>
@@ -732,12 +2932,14 @@
               <w:pStyle w:val="Compact"/>
               <w:jc w:val="center"/>
             </w:pPr>
+            <w:proofErr w:type="spellStart"/>
             <w:r>
               <w:rPr>
                 <w:rStyle w:val="VerbatimChar"/>
               </w:rPr>
               <w:t>Health_and_Personal_Care</w:t>
             </w:r>
+            <w:proofErr w:type="spellEnd"/>
           </w:p>
         </w:tc>
         <w:tc>
@@ -750,7 +2952,11 @@
               <w:jc w:val="center"/>
             </w:pPr>
             <w:r>
-              <w:t>Health and personal care reviews</w:t>
+              <w:t xml:space="preserve">Health and personal care </w:t>
+            </w:r>
+            <w:r>
+              <w:lastRenderedPageBreak/>
+              <w:t>reviews</w:t>
             </w:r>
           </w:p>
         </w:tc>
@@ -761,6 +2967,7 @@
         <w:pStyle w:val="a0"/>
       </w:pPr>
       <w:r>
+        <w:lastRenderedPageBreak/>
         <w:t>These categories were selected to provide variation in product type and complaint style while keeping the project feasible for local training and demonstration.</w:t>
       </w:r>
     </w:p>
@@ -768,11 +2975,13 @@
       <w:pPr>
         <w:pStyle w:val="3"/>
       </w:pPr>
-      <w:bookmarkStart w:id="5" w:name="review-value-dataset"/>
-      <w:bookmarkEnd w:id="4"/>
+      <w:bookmarkStart w:id="9" w:name="_Toc228470855"/>
+      <w:bookmarkStart w:id="10" w:name="review-value-dataset"/>
+      <w:bookmarkEnd w:id="8"/>
       <w:r>
         <w:t>3.2 Review-Value Dataset</w:t>
       </w:r>
+      <w:bookmarkEnd w:id="9"/>
     </w:p>
     <w:p>
       <w:pPr>
@@ -797,11 +3006,33 @@
       <w:pPr>
         <w:pStyle w:val="SourceCode"/>
       </w:pPr>
+      <w:proofErr w:type="spellStart"/>
       <w:r>
         <w:rPr>
           <w:rStyle w:val="VerbatimChar"/>
         </w:rPr>
-        <w:t>review_value_label = 1 if helpful_votes &gt;= 2 else 0</w:t>
+        <w:t>review_value_label</w:t>
+      </w:r>
+      <w:proofErr w:type="spellEnd"/>
+      <w:r>
+        <w:rPr>
+          <w:rStyle w:val="VerbatimChar"/>
+        </w:rPr>
+        <w:t xml:space="preserve"> = 1 if </w:t>
+      </w:r>
+      <w:proofErr w:type="spellStart"/>
+      <w:r>
+        <w:rPr>
+          <w:rStyle w:val="VerbatimChar"/>
+        </w:rPr>
+        <w:t>helpful_votes</w:t>
+      </w:r>
+      <w:proofErr w:type="spellEnd"/>
+      <w:r>
+        <w:rPr>
+          <w:rStyle w:val="VerbatimChar"/>
+        </w:rPr>
+        <w:t xml:space="preserve"> &gt;= 2 else 0</w:t>
       </w:r>
     </w:p>
     <w:p>
@@ -843,11 +3074,13 @@
       <w:pPr>
         <w:pStyle w:val="3"/>
       </w:pPr>
-      <w:bookmarkStart w:id="6" w:name="calibrated-sentiment-dataset"/>
-      <w:bookmarkEnd w:id="5"/>
+      <w:bookmarkStart w:id="11" w:name="_Toc228470856"/>
+      <w:bookmarkStart w:id="12" w:name="calibrated-sentiment-dataset"/>
+      <w:bookmarkEnd w:id="10"/>
       <w:r>
         <w:t>3.3 Calibrated Sentiment Dataset</w:t>
       </w:r>
+      <w:bookmarkEnd w:id="11"/>
     </w:p>
     <w:p>
       <w:pPr>
@@ -865,7 +3098,6 @@
         <w:pStyle w:val="a0"/>
       </w:pPr>
       <w:r>
-        <w:lastRenderedPageBreak/>
         <w:t>Specifically, the following rules are applied:</w:t>
       </w:r>
     </w:p>
@@ -899,6 +3131,7 @@
         <w:pStyle w:val="FirstParagraph"/>
       </w:pPr>
       <w:r>
+        <w:lastRenderedPageBreak/>
         <w:t>This design is motivated by the complementary nature of the two signals. Star ratings reflect the user's overall evaluation, while VADER captures sentiment expressed in the review text. Each signal alone can be noisy—for example, high ratings may still contain complaints, and text sentiment models may misinterpret context. By requiring agreement between rating and textual sentiment, the method filters out inconsistent or ambiguous cases</w:t>
       </w:r>
       <w:r>
@@ -952,11 +3185,13 @@
       <w:pPr>
         <w:pStyle w:val="3"/>
       </w:pPr>
-      <w:bookmarkStart w:id="7" w:name="pseudo-complaint-title-dataset"/>
-      <w:bookmarkEnd w:id="6"/>
+      <w:bookmarkStart w:id="13" w:name="_Toc228470857"/>
+      <w:bookmarkStart w:id="14" w:name="pseudo-complaint-title-dataset"/>
+      <w:bookmarkEnd w:id="12"/>
       <w:r>
         <w:t>3.4 Pseudo Complaint-Title Dataset</w:t>
       </w:r>
+      <w:bookmarkEnd w:id="13"/>
     </w:p>
     <w:p>
       <w:pPr>
@@ -1110,60 +3345,66 @@
         <w:pStyle w:val="a0"/>
       </w:pPr>
       <w:r>
+        <w:t>The pseudo-title data stays within the sampled review-value dataset universe. This keeps the dashboard, sentiment model, and title-generation task aligned to the same sampled products and categories.</w:t>
+      </w:r>
+    </w:p>
+    <w:p>
+      <w:pPr>
+        <w:pStyle w:val="3"/>
+      </w:pPr>
+      <w:bookmarkStart w:id="15" w:name="_Toc228470858"/>
+      <w:bookmarkStart w:id="16" w:name="X18aa0e9ef6fc5b874cb0b82ad1157c9dc193c13"/>
+      <w:bookmarkEnd w:id="14"/>
+      <w:r>
         <w:lastRenderedPageBreak/>
-        <w:t>The pseudo-title data stays within the sampled review-value dataset universe. This keeps the dashboard, sentiment model, and title-generation task aligned to the same sampled products and categories.</w:t>
-      </w:r>
+        <w:t>3.5 Dashboard Display Data</w:t>
+      </w:r>
+      <w:bookmarkEnd w:id="15"/>
+    </w:p>
+    <w:p>
+      <w:pPr>
+        <w:pStyle w:val="FirstParagraph"/>
+      </w:pPr>
+      <w:r>
+        <w:t>The dashboard display dataset is used only for interactive demonstration and business exploration. Model performance is always reported on held-out test splits, so the dashboard display scope is separated from evaluation.</w:t>
+      </w:r>
+    </w:p>
+    <w:p>
+      <w:pPr>
+        <w:pStyle w:val="a0"/>
+      </w:pPr>
+      <w:r>
+        <w:t>For usability, the dashboard displays the sampled full dataset across train, validation, and test. This improves product-level browsing because the sampled Amazon review data is highly long-tailed: many products have only one sampled review if only the test split is shown. This presentation choice does not affect reported model performance.</w:t>
+      </w:r>
+    </w:p>
+    <w:p>
+      <w:pPr>
+        <w:pStyle w:val="2"/>
+      </w:pPr>
+      <w:bookmarkStart w:id="17" w:name="_Toc228470859"/>
+      <w:bookmarkStart w:id="18" w:name="system-design-and-solution-approach"/>
+      <w:bookmarkEnd w:id="6"/>
+      <w:bookmarkEnd w:id="16"/>
+      <w:r>
+        <w:t xml:space="preserve">4. </w:t>
+      </w:r>
+      <w:bookmarkStart w:id="19" w:name="OLE_LINK1"/>
+      <w:r>
+        <w:t>System Design and Solution Approach</w:t>
+      </w:r>
+      <w:bookmarkEnd w:id="17"/>
+      <w:bookmarkEnd w:id="19"/>
     </w:p>
     <w:p>
       <w:pPr>
         <w:pStyle w:val="3"/>
       </w:pPr>
-      <w:bookmarkStart w:id="8" w:name="X18aa0e9ef6fc5b874cb0b82ad1157c9dc193c13"/>
-      <w:bookmarkEnd w:id="7"/>
-      <w:r>
-        <w:t>3.5 Dashboard Display Data</w:t>
-      </w:r>
-    </w:p>
-    <w:p>
-      <w:pPr>
-        <w:pStyle w:val="FirstParagraph"/>
-      </w:pPr>
-      <w:r>
-        <w:t>The dashboard display dataset is used only for interactive demonstration and business exploration. Model performance is always reported on held-out test splits, so the dashboard display scope is separated from evaluation.</w:t>
-      </w:r>
-    </w:p>
-    <w:p>
-      <w:pPr>
-        <w:pStyle w:val="a0"/>
-      </w:pPr>
-      <w:r>
-        <w:t>For usability, the dashboard displays the sampled full dataset across train, validation, and test. This improves product-level browsing because the sampled Amazon review data is highly long-tailed: many products have only one sampled review if only the test split is shown. This presentation choice does not affect reported model performance.</w:t>
-      </w:r>
-    </w:p>
-    <w:p>
-      <w:pPr>
-        <w:pStyle w:val="2"/>
-      </w:pPr>
-      <w:bookmarkStart w:id="9" w:name="system-design-and-solution-approach"/>
-      <w:bookmarkEnd w:id="3"/>
-      <w:bookmarkEnd w:id="8"/>
-      <w:r>
-        <w:t xml:space="preserve">4. </w:t>
-      </w:r>
-      <w:bookmarkStart w:id="10" w:name="OLE_LINK1"/>
-      <w:r>
-        <w:t>System Design and Solution Approach</w:t>
-      </w:r>
-      <w:bookmarkEnd w:id="10"/>
-    </w:p>
-    <w:p>
-      <w:pPr>
-        <w:pStyle w:val="3"/>
-      </w:pPr>
-      <w:bookmarkStart w:id="11" w:name="overall-architecture"/>
+      <w:bookmarkStart w:id="20" w:name="_Toc228470860"/>
+      <w:bookmarkStart w:id="21" w:name="overall-architecture"/>
       <w:r>
         <w:t>4.1 Overall Architecture</w:t>
       </w:r>
+      <w:bookmarkEnd w:id="20"/>
     </w:p>
     <w:p>
       <w:pPr>
@@ -1321,15 +3562,15 @@
         <w:pStyle w:val="FirstParagraph"/>
       </w:pPr>
       <w:r>
+        <w:t>The online pipeline is used for demonstration and business exploration. It connects trained models and fallback logic into a user-facing workflow. For example, a user can select a product, inspect negative review patterns, generate complaint titles, upload a CSV file, or ask the Merchant Copilot about the current review scope.</w:t>
+      </w:r>
+    </w:p>
+    <w:p>
+      <w:pPr>
+        <w:pStyle w:val="a0"/>
+      </w:pPr>
+      <w:r>
         <w:lastRenderedPageBreak/>
-        <w:t>The online pipeline is used for demonstration and business exploration. It connects trained models and fallback logic into a user-facing workflow. For example, a user can select a product, inspect negative review patterns, generate complaint titles, upload a CSV file, or ask the Merchant Copilot about the current review scope.</w:t>
-      </w:r>
-    </w:p>
-    <w:p>
-      <w:pPr>
-        <w:pStyle w:val="a0"/>
-      </w:pPr>
-      <w:r>
         <w:t>This two-pipeline design helps distinguish model development from system use. The offline pipeline answers whether the models perform well on held-out test data. The online pipeline shows whether the trained components can be integrated into a practical merchant-facing review analytics system.</w:t>
       </w:r>
     </w:p>
@@ -1389,11 +3630,13 @@
       <w:pPr>
         <w:pStyle w:val="3"/>
       </w:pPr>
-      <w:bookmarkStart w:id="12" w:name="text-cleaning-and-preprocessing"/>
-      <w:bookmarkEnd w:id="11"/>
+      <w:bookmarkStart w:id="22" w:name="_Toc228470861"/>
+      <w:bookmarkStart w:id="23" w:name="text-cleaning-and-preprocessing"/>
+      <w:bookmarkEnd w:id="21"/>
       <w:r>
         <w:t>4.2 Text Cleaning and Preprocessing</w:t>
       </w:r>
+      <w:bookmarkEnd w:id="22"/>
     </w:p>
     <w:p>
       <w:pPr>
@@ -1415,11 +3658,13 @@
       <w:pPr>
         <w:pStyle w:val="3"/>
       </w:pPr>
-      <w:bookmarkStart w:id="13" w:name="review-value-classification"/>
-      <w:bookmarkEnd w:id="12"/>
+      <w:bookmarkStart w:id="24" w:name="_Toc228470862"/>
+      <w:bookmarkStart w:id="25" w:name="review-value-classification"/>
+      <w:bookmarkEnd w:id="23"/>
       <w:r>
         <w:t>4.3 Review-Value Classification</w:t>
       </w:r>
+      <w:bookmarkEnd w:id="24"/>
     </w:p>
     <w:p>
       <w:pPr>
@@ -1442,30 +3687,40 @@
         <w:pStyle w:val="a0"/>
       </w:pPr>
       <w:r>
-        <w:t xml:space="preserve">This method was selected because it is efficient, interpretable, and suitable for a relatively small coursework dataset. Compared with a deep neural classifier, TF-IDF with Logistic Regression is faster to train, easier to debug, and more practical for </w:t>
+        <w:t>This method was selected because it is efficient, interpretable, and suitable for a relatively small coursework dataset. Compared with a deep neural classifier, TF-IDF with Logistic Regression is faster to train, easier to debug, and more practical for lightweight dashboard inference. It also provides a strong baseline before introducing more expensive models.</w:t>
+      </w:r>
+    </w:p>
+    <w:p>
+      <w:pPr>
+        <w:pStyle w:val="a0"/>
+      </w:pPr>
+      <w:r>
+        <w:t xml:space="preserve">This design provides a balance between performance and efficiency. However, it has limitations: it cannot fully capture deep semantics, long-range context, or </w:t>
       </w:r>
       <w:r>
         <w:lastRenderedPageBreak/>
-        <w:t>lightweight dashboard inference. It also provides a strong baseline before introducing more expensive models.</w:t>
-      </w:r>
-    </w:p>
-    <w:p>
-      <w:pPr>
-        <w:pStyle w:val="a0"/>
-      </w:pPr>
-      <w:r>
-        <w:t>This design provides a balance between performance and efficiency. However, it has limitations: it cannot fully capture deep semantics, long-range context, or subtle reasoning about why a review is useful. It also depends on helpful votes as proxy labels, which may reflect product visibility rather than true review quality. Therefore, this component is positioned as a prioritisation signal and baseline classifier rather than a perfect model of business value.</w:t>
+        <w:t xml:space="preserve">subtle reasoning about why a review is useful. It also depends on helpful votes as proxy labels, which may reflect product visibility rather than true review quality. Therefore, this component is positioned as a </w:t>
+      </w:r>
+      <w:proofErr w:type="spellStart"/>
+      <w:r>
+        <w:t>prioritisation</w:t>
+      </w:r>
+      <w:proofErr w:type="spellEnd"/>
+      <w:r>
+        <w:t xml:space="preserve"> signal and baseline classifier rather than a perfect model of business value.</w:t>
       </w:r>
     </w:p>
     <w:p>
       <w:pPr>
         <w:pStyle w:val="3"/>
       </w:pPr>
-      <w:bookmarkStart w:id="14" w:name="sentiment-mining"/>
-      <w:bookmarkEnd w:id="13"/>
+      <w:bookmarkStart w:id="26" w:name="_Toc228470863"/>
+      <w:bookmarkStart w:id="27" w:name="sentiment-mining"/>
+      <w:bookmarkEnd w:id="25"/>
       <w:r>
         <w:t>4.4 Sentiment Mining</w:t>
       </w:r>
+      <w:bookmarkEnd w:id="26"/>
     </w:p>
     <w:p>
       <w:pPr>
@@ -1474,11 +3729,19 @@
       <w:r>
         <w:t xml:space="preserve">The sentiment component fine-tunes </w:t>
       </w:r>
+      <w:proofErr w:type="spellStart"/>
       <w:r>
         <w:rPr>
           <w:rStyle w:val="VerbatimChar"/>
         </w:rPr>
-        <w:t>bert-base-uncased</w:t>
+        <w:t>bert</w:t>
+      </w:r>
+      <w:proofErr w:type="spellEnd"/>
+      <w:r>
+        <w:rPr>
+          <w:rStyle w:val="VerbatimChar"/>
+        </w:rPr>
+        <w:t>-base-uncased</w:t>
       </w:r>
       <w:r>
         <w:t xml:space="preserve"> for binary sentiment classification. The input is cleaned review text, and the target label is the calibrated sentiment label.</w:t>
@@ -1489,7 +3752,15 @@
         <w:pStyle w:val="a0"/>
       </w:pPr>
       <w:r>
-        <w:t>The training configuration is summarised below:</w:t>
+        <w:t xml:space="preserve">The training configuration is </w:t>
+      </w:r>
+      <w:proofErr w:type="spellStart"/>
+      <w:r>
+        <w:t>summarised</w:t>
+      </w:r>
+      <w:proofErr w:type="spellEnd"/>
+      <w:r>
+        <w:t xml:space="preserve"> below:</w:t>
       </w:r>
     </w:p>
     <w:tbl>
@@ -1566,11 +3837,19 @@
               <w:pStyle w:val="Compact"/>
               <w:jc w:val="center"/>
             </w:pPr>
+            <w:proofErr w:type="spellStart"/>
             <w:r>
               <w:rPr>
                 <w:rStyle w:val="VerbatimChar"/>
               </w:rPr>
-              <w:t>bert-base-uncased</w:t>
+              <w:t>bert</w:t>
+            </w:r>
+            <w:proofErr w:type="spellEnd"/>
+            <w:r>
+              <w:rPr>
+                <w:rStyle w:val="VerbatimChar"/>
+              </w:rPr>
+              <w:t>-base-uncased</w:t>
             </w:r>
           </w:p>
         </w:tc>
@@ -1781,11 +4060,19 @@
       <w:r>
         <w:t xml:space="preserve">BERT was selected because sentiment often depends on context rather than isolated keywords. Compared with a purely rule-based method such as VADER, a fine-tuned Transformer can learn contextual patterns such as negation, complaint phrasing, and domain-specific expressions. Compared with training a neural network from scratch, fine-tuning </w:t>
       </w:r>
+      <w:proofErr w:type="spellStart"/>
       <w:r>
         <w:rPr>
           <w:rStyle w:val="VerbatimChar"/>
         </w:rPr>
-        <w:t>bert-base-uncased</w:t>
+        <w:t>bert</w:t>
+      </w:r>
+      <w:proofErr w:type="spellEnd"/>
+      <w:r>
+        <w:rPr>
+          <w:rStyle w:val="VerbatimChar"/>
+        </w:rPr>
+        <w:t>-base-uncased</w:t>
       </w:r>
       <w:r>
         <w:t xml:space="preserve"> is more data-efficient and more realistic for a limited project dataset.</w:t>
@@ -1803,19 +4090,36 @@
       <w:pPr>
         <w:pStyle w:val="3"/>
       </w:pPr>
-      <w:bookmarkStart w:id="15" w:name="complaint-title-generation"/>
-      <w:bookmarkEnd w:id="14"/>
-      <w:r>
-        <w:lastRenderedPageBreak/>
+      <w:bookmarkStart w:id="28" w:name="_Toc228470864"/>
+      <w:bookmarkStart w:id="29" w:name="complaint-title-generation"/>
+      <w:bookmarkEnd w:id="27"/>
+      <w:r>
         <w:t>4.5 Complaint-Title Generation</w:t>
       </w:r>
+      <w:bookmarkEnd w:id="28"/>
     </w:p>
     <w:p>
       <w:pPr>
         <w:pStyle w:val="FirstParagraph"/>
       </w:pPr>
       <w:r>
-        <w:t>The complaint-title generation component is designed as a short summarisation task. For a negative review, the model generates a concise title that captures the main complaint. For example, a long review about an inaccurate thermometer may be summarised as “Thermometer reading inaccurate”.</w:t>
+        <w:t xml:space="preserve">The complaint-title generation component is designed as a short </w:t>
+      </w:r>
+      <w:proofErr w:type="spellStart"/>
+      <w:r>
+        <w:t>summarisation</w:t>
+      </w:r>
+      <w:proofErr w:type="spellEnd"/>
+      <w:r>
+        <w:t xml:space="preserve"> task. For a negative review, the model generates a concise title that captures the main complaint. For example, a long review about an inaccurate thermometer may be </w:t>
+      </w:r>
+      <w:proofErr w:type="spellStart"/>
+      <w:r>
+        <w:t>summarised</w:t>
+      </w:r>
+      <w:proofErr w:type="spellEnd"/>
+      <w:r>
+        <w:t xml:space="preserve"> as “Thermometer reading inaccurate”.</w:t>
       </w:r>
     </w:p>
     <w:p>
@@ -1835,6 +4139,7 @@
         </w:numPr>
       </w:pPr>
       <w:r>
+        <w:lastRenderedPageBreak/>
         <w:t>An LLM teacher generates pseudo complaint-title labels for negative reviews.</w:t>
       </w:r>
     </w:p>
@@ -2282,8 +4587,13 @@
               <w:pStyle w:val="Compact"/>
               <w:jc w:val="center"/>
             </w:pPr>
-            <w:r>
-              <w:t>BERTScore F1</w:t>
+            <w:proofErr w:type="spellStart"/>
+            <w:r>
+              <w:t>BERTScore</w:t>
+            </w:r>
+            <w:proofErr w:type="spellEnd"/>
+            <w:r>
+              <w:t xml:space="preserve"> F1</w:t>
             </w:r>
           </w:p>
         </w:tc>
@@ -2318,19 +4628,37 @@
         <w:pStyle w:val="a0"/>
       </w:pPr>
       <w:r>
+        <w:t xml:space="preserve">This design provides a balance between title quality, runtime cost, and local </w:t>
+      </w:r>
+      <w:proofErr w:type="spellStart"/>
+      <w:r>
+        <w:t>deployability</w:t>
+      </w:r>
+      <w:proofErr w:type="spellEnd"/>
+      <w:r>
+        <w:t xml:space="preserve">. However, it has limitations: the student model learns from LLM-generated pseudo labels, so it can inherit teacher-model bias or noise. It may also produce titles that are concise but not fully faithful to the original review. Therefore, this component is positioned as an approximate complaint-title generator that supports review exploration, not as a human-certified </w:t>
+      </w:r>
+      <w:proofErr w:type="spellStart"/>
+      <w:r>
+        <w:t>summarisation</w:t>
+      </w:r>
+      <w:proofErr w:type="spellEnd"/>
+      <w:r>
+        <w:t xml:space="preserve"> system.</w:t>
+      </w:r>
+    </w:p>
+    <w:p>
+      <w:pPr>
+        <w:pStyle w:val="3"/>
+      </w:pPr>
+      <w:bookmarkStart w:id="30" w:name="_Toc228470865"/>
+      <w:bookmarkStart w:id="31" w:name="dashboard-and-merchant-copilot"/>
+      <w:bookmarkEnd w:id="29"/>
+      <w:r>
         <w:lastRenderedPageBreak/>
-        <w:t>This design provides a balance between title quality, runtime cost, and local deployability. However, it has limitations: the student model learns from LLM-generated pseudo labels, so it can inherit teacher-model bias or noise. It may also produce titles that are concise but not fully faithful to the original review. Therefore, this component is positioned as an approximate complaint-title generator that supports review exploration, not as a human-certified summarisation system.</w:t>
-      </w:r>
-    </w:p>
-    <w:p>
-      <w:pPr>
-        <w:pStyle w:val="3"/>
-      </w:pPr>
-      <w:bookmarkStart w:id="16" w:name="dashboard-and-merchant-copilot"/>
-      <w:bookmarkEnd w:id="15"/>
-      <w:r>
         <w:t>4.6 Dashboard and Merchant Copilot</w:t>
       </w:r>
+      <w:bookmarkEnd w:id="30"/>
     </w:p>
     <w:p>
       <w:pPr>
@@ -2572,21 +4900,25 @@
       <w:pPr>
         <w:pStyle w:val="2"/>
       </w:pPr>
-      <w:bookmarkStart w:id="17" w:name="evaluation-and-test-results"/>
-      <w:bookmarkEnd w:id="9"/>
-      <w:bookmarkEnd w:id="16"/>
+      <w:bookmarkStart w:id="32" w:name="_Toc228470866"/>
+      <w:bookmarkStart w:id="33" w:name="evaluation-and-test-results"/>
+      <w:bookmarkEnd w:id="18"/>
+      <w:bookmarkEnd w:id="31"/>
       <w:r>
         <w:t>5. Evaluation and Test Results</w:t>
       </w:r>
+      <w:bookmarkEnd w:id="32"/>
     </w:p>
     <w:p>
       <w:pPr>
         <w:pStyle w:val="3"/>
       </w:pPr>
-      <w:bookmarkStart w:id="18" w:name="evaluation-setup"/>
+      <w:bookmarkStart w:id="34" w:name="_Toc228470867"/>
+      <w:bookmarkStart w:id="35" w:name="evaluation-setup"/>
       <w:r>
         <w:t>5.1 Evaluation Setup</w:t>
       </w:r>
+      <w:bookmarkEnd w:id="34"/>
     </w:p>
     <w:p>
       <w:pPr>
@@ -2745,7 +5077,15 @@
               <w:jc w:val="center"/>
             </w:pPr>
             <w:r>
-              <w:t>ROUGE-1, ROUGE-2, ROUGE-L, BERTScore F1</w:t>
+              <w:t xml:space="preserve">ROUGE-1, ROUGE-2, ROUGE-L, </w:t>
+            </w:r>
+            <w:proofErr w:type="spellStart"/>
+            <w:r>
+              <w:t>BERTScore</w:t>
+            </w:r>
+            <w:proofErr w:type="spellEnd"/>
+            <w:r>
+              <w:t xml:space="preserve"> F1</w:t>
             </w:r>
           </w:p>
         </w:tc>
@@ -2755,11 +5095,13 @@
       <w:pPr>
         <w:pStyle w:val="3"/>
       </w:pPr>
-      <w:bookmarkStart w:id="19" w:name="review-value-classification-results"/>
-      <w:bookmarkEnd w:id="18"/>
+      <w:bookmarkStart w:id="36" w:name="_Toc228470868"/>
+      <w:bookmarkStart w:id="37" w:name="review-value-classification-results"/>
+      <w:bookmarkEnd w:id="35"/>
       <w:r>
         <w:t>5.2 Review-Value Classification Results</w:t>
       </w:r>
+      <w:bookmarkEnd w:id="36"/>
     </w:p>
     <w:tbl>
       <w:tblPr>
@@ -2930,18 +5272,28 @@
         <w:pStyle w:val="a0"/>
       </w:pPr>
       <w:r>
-        <w:t>Because high-value reviews are the minority class, accuracy alone is not sufficient. The positive-class F1 score of 0.255 shows that this component is still the weakest part of the pipeline. It can still be used as a prioritisation signal, but it should not be treated as a perfect detector of business value.</w:t>
+        <w:t xml:space="preserve">Because high-value reviews are the minority class, accuracy alone is not sufficient. The positive-class F1 score of 0.255 shows that this component is still the weakest part of the pipeline. It can still be used as a </w:t>
+      </w:r>
+      <w:proofErr w:type="spellStart"/>
+      <w:r>
+        <w:t>prioritisation</w:t>
+      </w:r>
+      <w:proofErr w:type="spellEnd"/>
+      <w:r>
+        <w:t xml:space="preserve"> signal, but it should not be treated as a perfect detector of business value.</w:t>
       </w:r>
     </w:p>
     <w:p>
       <w:pPr>
         <w:pStyle w:val="3"/>
       </w:pPr>
-      <w:bookmarkStart w:id="20" w:name="sentiment-mining-results"/>
-      <w:bookmarkEnd w:id="19"/>
+      <w:bookmarkStart w:id="38" w:name="_Toc228470869"/>
+      <w:bookmarkStart w:id="39" w:name="sentiment-mining-results"/>
+      <w:bookmarkEnd w:id="37"/>
       <w:r>
         <w:t>5.3 Sentiment Mining Results</w:t>
       </w:r>
+      <w:bookmarkEnd w:id="38"/>
     </w:p>
     <w:tbl>
       <w:tblPr>
@@ -3100,6 +5452,7 @@
               <w:jc w:val="center"/>
             </w:pPr>
             <w:r>
+              <w:lastRenderedPageBreak/>
               <w:t>Test F1</w:t>
             </w:r>
           </w:p>
@@ -3132,7 +5485,6 @@
               <w:jc w:val="center"/>
             </w:pPr>
             <w:r>
-              <w:lastRenderedPageBreak/>
               <w:t>Test macro-F1</w:t>
             </w:r>
           </w:p>
@@ -3164,11 +5516,13 @@
       <w:pPr>
         <w:pStyle w:val="3"/>
       </w:pPr>
-      <w:bookmarkStart w:id="21" w:name="complaint-title-generation-results"/>
-      <w:bookmarkEnd w:id="20"/>
+      <w:bookmarkStart w:id="40" w:name="_Toc228470870"/>
+      <w:bookmarkStart w:id="41" w:name="complaint-title-generation-results"/>
+      <w:bookmarkEnd w:id="39"/>
       <w:r>
         <w:t>5.4 Complaint-Title Generation Results</w:t>
       </w:r>
+      <w:bookmarkEnd w:id="40"/>
     </w:p>
     <w:tbl>
       <w:tblPr>
@@ -3260,8 +5614,13 @@
               <w:pStyle w:val="Compact"/>
               <w:jc w:val="center"/>
             </w:pPr>
-            <w:r>
-              <w:t>BERTScore F1</w:t>
+            <w:proofErr w:type="spellStart"/>
+            <w:r>
+              <w:t>BERTScore</w:t>
+            </w:r>
+            <w:proofErr w:type="spellEnd"/>
+            <w:r>
+              <w:t xml:space="preserve"> F1</w:t>
             </w:r>
           </w:p>
         </w:tc>
@@ -3418,7 +5777,15 @@
         <w:pStyle w:val="a0"/>
       </w:pPr>
       <w:r>
-        <w:t>Flan-T5-base outperforms Flan-T5-small on every reported metric. The best title-generation result is ROUGE-L F1 0.373 and BERTScore F1 0.830. Therefore, Flan-T5-base is selected as the preferred local complaint-title model.</w:t>
+        <w:t xml:space="preserve">Flan-T5-base outperforms Flan-T5-small on every reported metric. The best title-generation result is ROUGE-L F1 0.373 and </w:t>
+      </w:r>
+      <w:proofErr w:type="spellStart"/>
+      <w:r>
+        <w:t>BERTScore</w:t>
+      </w:r>
+      <w:proofErr w:type="spellEnd"/>
+      <w:r>
+        <w:t xml:space="preserve"> F1 0.830. Therefore, Flan-T5-base is selected as the preferred local complaint-title model.</w:t>
       </w:r>
     </w:p>
     <w:p>
@@ -3433,11 +5800,13 @@
       <w:pPr>
         <w:pStyle w:val="3"/>
       </w:pPr>
-      <w:bookmarkStart w:id="22" w:name="qualitative-analysis"/>
-      <w:bookmarkEnd w:id="21"/>
+      <w:bookmarkStart w:id="42" w:name="_Toc228470871"/>
+      <w:bookmarkStart w:id="43" w:name="qualitative-analysis"/>
+      <w:bookmarkEnd w:id="41"/>
       <w:r>
         <w:t>5.5 Qualitative Analysis</w:t>
       </w:r>
+      <w:bookmarkEnd w:id="42"/>
     </w:p>
     <w:p>
       <w:pPr>
@@ -3537,7 +5906,15 @@
               <w:jc w:val="center"/>
             </w:pPr>
             <w:r>
-              <w:t>“I've been advised to use Miele products for my Miele appliances. Miele i...”</w:t>
+              <w:t xml:space="preserve">“I've been advised to use Miele products for my Miele appliances. Miele </w:t>
+            </w:r>
+            <w:proofErr w:type="spellStart"/>
+            <w:r>
+              <w:t>i</w:t>
+            </w:r>
+            <w:proofErr w:type="spellEnd"/>
+            <w:r>
+              <w:t>...”</w:t>
             </w:r>
           </w:p>
         </w:tc>
@@ -3594,7 +5971,19 @@
               <w:jc w:val="center"/>
             </w:pPr>
             <w:r>
-              <w:t>“I personally don't drink coffee but my Mom has 2 of these that she used...”</w:t>
+              <w:t xml:space="preserve">“I personally don't drink coffee but my </w:t>
+            </w:r>
+            <w:proofErr w:type="gramStart"/>
+            <w:r>
+              <w:t>Mom</w:t>
+            </w:r>
+            <w:proofErr w:type="gramEnd"/>
+            <w:r>
+              <w:t xml:space="preserve"> has 2 of these that </w:t>
+            </w:r>
+            <w:r>
+              <w:lastRenderedPageBreak/>
+              <w:t>she used...”</w:t>
             </w:r>
           </w:p>
         </w:tc>
@@ -3607,6 +5996,7 @@
               <w:jc w:val="center"/>
             </w:pPr>
             <w:r>
+              <w:lastRenderedPageBreak/>
               <w:t>Pods don't fit Keurig</w:t>
             </w:r>
           </w:p>
@@ -3651,11 +6041,7 @@
               <w:jc w:val="center"/>
             </w:pPr>
             <w:r>
-              <w:t xml:space="preserve">“Cheap! I was </w:t>
-            </w:r>
-            <w:r>
-              <w:lastRenderedPageBreak/>
-              <w:t>saddened and disheartened by the quality. Nope! Don’t do it...”</w:t>
+              <w:t>“Cheap! I was saddened and disheartened by the quality. Nope! Don’t do it...”</w:t>
             </w:r>
           </w:p>
         </w:tc>
@@ -3668,12 +6054,7 @@
               <w:jc w:val="center"/>
             </w:pPr>
             <w:r>
-              <w:lastRenderedPageBreak/>
-              <w:t xml:space="preserve">Low product </w:t>
-            </w:r>
-            <w:r>
-              <w:lastRenderedPageBreak/>
-              <w:t>quality</w:t>
+              <w:t>Low product quality</w:t>
             </w:r>
           </w:p>
         </w:tc>
@@ -3686,12 +6067,7 @@
               <w:jc w:val="center"/>
             </w:pPr>
             <w:r>
-              <w:lastRenderedPageBreak/>
-              <w:t xml:space="preserve">I was saddened </w:t>
-            </w:r>
-            <w:r>
-              <w:lastRenderedPageBreak/>
-              <w:t>and disheartened by the quality</w:t>
+              <w:t>I was saddened and disheartened by the quality</w:t>
             </w:r>
           </w:p>
         </w:tc>
@@ -3704,12 +6080,7 @@
               <w:jc w:val="center"/>
             </w:pPr>
             <w:r>
-              <w:lastRenderedPageBreak/>
-              <w:t xml:space="preserve">Cheaply made bad </w:t>
-            </w:r>
-            <w:r>
-              <w:lastRenderedPageBreak/>
-              <w:t>quality</w:t>
+              <w:t>Cheaply made bad quality</w:t>
             </w:r>
           </w:p>
         </w:tc>
@@ -3720,7 +6091,6 @@
         <w:pStyle w:val="a0"/>
       </w:pPr>
       <w:r>
-        <w:lastRenderedPageBreak/>
         <w:t>This qualitative check is not a full benchmark, but it supports the test metrics: fine-tuning makes the title generator more concise and more aligned with the complaint-title format.</w:t>
       </w:r>
     </w:p>
@@ -3728,12 +6098,14 @@
       <w:pPr>
         <w:pStyle w:val="2"/>
       </w:pPr>
-      <w:bookmarkStart w:id="23" w:name="limitations-and-future-work"/>
-      <w:bookmarkEnd w:id="17"/>
-      <w:bookmarkEnd w:id="22"/>
+      <w:bookmarkStart w:id="44" w:name="_Toc228470872"/>
+      <w:bookmarkStart w:id="45" w:name="limitations-and-future-work"/>
+      <w:bookmarkEnd w:id="33"/>
+      <w:bookmarkEnd w:id="43"/>
       <w:r>
         <w:t>6. Limitations and Future Work</w:t>
       </w:r>
+      <w:bookmarkEnd w:id="44"/>
     </w:p>
     <w:p>
       <w:pPr>
@@ -3764,7 +6136,15 @@
         <w:pStyle w:val="a0"/>
       </w:pPr>
       <w:r>
-        <w:t>Third, complaint-title labels are LLM-generated pseudo labels. ROUGE and BERTScore measure similarity to these pseudo references, not necessarily similarity to human-written complaint summaries.</w:t>
+        <w:t xml:space="preserve">Third, complaint-title labels are LLM-generated pseudo labels. ROUGE and </w:t>
+      </w:r>
+      <w:proofErr w:type="spellStart"/>
+      <w:r>
+        <w:t>BERTScore</w:t>
+      </w:r>
+      <w:proofErr w:type="spellEnd"/>
+      <w:r>
+        <w:t xml:space="preserve"> measure similarity to these pseudo references, not necessarily similarity to human-written complaint summaries.</w:t>
       </w:r>
     </w:p>
     <w:p>
@@ -3803,19 +6183,37 @@
       <w:pPr>
         <w:pStyle w:val="2"/>
       </w:pPr>
-      <w:bookmarkStart w:id="24" w:name="conclusion"/>
-      <w:bookmarkEnd w:id="23"/>
+      <w:bookmarkStart w:id="46" w:name="_Toc228470873"/>
+      <w:bookmarkStart w:id="47" w:name="conclusion"/>
+      <w:bookmarkEnd w:id="45"/>
       <w:r>
         <w:lastRenderedPageBreak/>
         <w:t>7. Conclusion</w:t>
       </w:r>
+      <w:bookmarkEnd w:id="46"/>
     </w:p>
     <w:p>
       <w:pPr>
         <w:pStyle w:val="FirstParagraph"/>
       </w:pPr>
       <w:r>
-        <w:t>This project builds an end-to-end language processing system for e-commerce review analytics. It addresses a practical business problem by helping merchants prioritise useful reviews, detect negative customer experience, and summarise complaints into concise issue titles.</w:t>
+        <w:t xml:space="preserve">This project builds an end-to-end language processing system for e-commerce review analytics. It addresses a practical business problem by helping merchants </w:t>
+      </w:r>
+      <w:proofErr w:type="spellStart"/>
+      <w:r>
+        <w:t>prioritise</w:t>
+      </w:r>
+      <w:proofErr w:type="spellEnd"/>
+      <w:r>
+        <w:t xml:space="preserve"> useful reviews, detect negative customer experience, and </w:t>
+      </w:r>
+      <w:proofErr w:type="spellStart"/>
+      <w:r>
+        <w:t>summarise</w:t>
+      </w:r>
+      <w:proofErr w:type="spellEnd"/>
+      <w:r>
+        <w:t xml:space="preserve"> complaints into concise issue titles.</w:t>
       </w:r>
     </w:p>
     <w:p>
@@ -3838,11 +6236,13 @@
       <w:pPr>
         <w:pStyle w:val="2"/>
       </w:pPr>
-      <w:bookmarkStart w:id="25" w:name="references"/>
-      <w:bookmarkEnd w:id="24"/>
+      <w:bookmarkStart w:id="48" w:name="_Toc228470874"/>
+      <w:bookmarkStart w:id="49" w:name="references"/>
+      <w:bookmarkEnd w:id="47"/>
       <w:r>
         <w:t>8. References</w:t>
       </w:r>
+      <w:bookmarkEnd w:id="48"/>
     </w:p>
     <w:p>
       <w:pPr>
@@ -3856,10 +6256,12 @@
       <w:pPr>
         <w:pStyle w:val="3"/>
       </w:pPr>
-      <w:bookmarkStart w:id="26" w:name="dataset"/>
+      <w:bookmarkStart w:id="50" w:name="_Toc228470875"/>
+      <w:bookmarkStart w:id="51" w:name="dataset"/>
       <w:r>
         <w:t>8.1 Dataset</w:t>
       </w:r>
+      <w:bookmarkEnd w:id="50"/>
     </w:p>
     <w:p>
       <w:pPr>
@@ -3885,11 +6287,13 @@
       <w:pPr>
         <w:pStyle w:val="3"/>
       </w:pPr>
-      <w:bookmarkStart w:id="27" w:name="pre-trained-models"/>
-      <w:bookmarkEnd w:id="26"/>
+      <w:bookmarkStart w:id="52" w:name="_Toc228470876"/>
+      <w:bookmarkStart w:id="53" w:name="pre-trained-models"/>
+      <w:bookmarkEnd w:id="51"/>
       <w:r>
         <w:t>8.2 Pre-trained Models</w:t>
       </w:r>
+      <w:bookmarkEnd w:id="52"/>
     </w:p>
     <w:p>
       <w:pPr>
@@ -3902,11 +6306,19 @@
         <w:br/>
         <w:t xml:space="preserve">Model: </w:t>
       </w:r>
+      <w:proofErr w:type="spellStart"/>
       <w:r>
         <w:rPr>
           <w:rStyle w:val="VerbatimChar"/>
         </w:rPr>
-        <w:t>bert-base-uncased</w:t>
+        <w:t>bert</w:t>
+      </w:r>
+      <w:proofErr w:type="spellEnd"/>
+      <w:r>
+        <w:rPr>
+          <w:rStyle w:val="VerbatimChar"/>
+        </w:rPr>
+        <w:t>-base-uncased</w:t>
       </w:r>
       <w:r>
         <w:t>.</w:t>
@@ -3978,12 +6390,14 @@
       <w:pPr>
         <w:pStyle w:val="3"/>
       </w:pPr>
-      <w:bookmarkStart w:id="28" w:name="libraries-and-tools"/>
-      <w:bookmarkEnd w:id="27"/>
+      <w:bookmarkStart w:id="54" w:name="_Toc228470877"/>
+      <w:bookmarkStart w:id="55" w:name="libraries-and-tools"/>
+      <w:bookmarkEnd w:id="53"/>
       <w:r>
         <w:lastRenderedPageBreak/>
         <w:t>8.3 Libraries and Tools</w:t>
       </w:r>
+      <w:bookmarkEnd w:id="54"/>
     </w:p>
     <w:p>
       <w:pPr>
@@ -4044,7 +6458,15 @@
         <w:pStyle w:val="a0"/>
       </w:pPr>
       <w:r>
-        <w:t xml:space="preserve">[7] joblib. </w:t>
+        <w:t xml:space="preserve">[7] </w:t>
+      </w:r>
+      <w:proofErr w:type="spellStart"/>
+      <w:r>
+        <w:t>joblib</w:t>
+      </w:r>
+      <w:proofErr w:type="spellEnd"/>
+      <w:r>
+        <w:t xml:space="preserve">. </w:t>
       </w:r>
       <w:proofErr w:type="spellStart"/>
       <w:r>
@@ -4106,7 +6528,15 @@
         <w:pStyle w:val="a0"/>
       </w:pPr>
       <w:r>
-        <w:t xml:space="preserve">[9] PyTorch. </w:t>
+        <w:t xml:space="preserve">[9] </w:t>
+      </w:r>
+      <w:proofErr w:type="spellStart"/>
+      <w:r>
+        <w:t>PyTorch</w:t>
+      </w:r>
+      <w:proofErr w:type="spellEnd"/>
+      <w:r>
+        <w:t xml:space="preserve">. </w:t>
       </w:r>
       <w:proofErr w:type="spellStart"/>
       <w:r>
@@ -4213,7 +6643,15 @@
         <w:pStyle w:val="a0"/>
       </w:pPr>
       <w:r>
-        <w:t xml:space="preserve">[12] Streamlit. </w:t>
+        <w:t xml:space="preserve">[12] </w:t>
+      </w:r>
+      <w:proofErr w:type="spellStart"/>
+      <w:r>
+        <w:t>Streamlit</w:t>
+      </w:r>
+      <w:proofErr w:type="spellEnd"/>
+      <w:r>
+        <w:t xml:space="preserve">. </w:t>
       </w:r>
       <w:proofErr w:type="spellStart"/>
       <w:r>
@@ -4262,18 +6700,28 @@
       <w:pPr>
         <w:pStyle w:val="3"/>
       </w:pPr>
-      <w:bookmarkStart w:id="29" w:name="source-code"/>
-      <w:bookmarkEnd w:id="28"/>
+      <w:bookmarkStart w:id="56" w:name="_Toc228470878"/>
+      <w:bookmarkStart w:id="57" w:name="source-code"/>
+      <w:bookmarkEnd w:id="55"/>
       <w:r>
         <w:t>8.4 Source Code</w:t>
       </w:r>
+      <w:bookmarkEnd w:id="56"/>
     </w:p>
     <w:p>
       <w:pPr>
         <w:pStyle w:val="FirstParagraph"/>
       </w:pPr>
       <w:r>
-        <w:t>[14] Zhao, Yisen. Review Insight System Project Repository.</w:t>
+        <w:t xml:space="preserve">[14] Zhao, </w:t>
+      </w:r>
+      <w:proofErr w:type="spellStart"/>
+      <w:r>
+        <w:t>Yisen</w:t>
+      </w:r>
+      <w:proofErr w:type="spellEnd"/>
+      <w:r>
+        <w:t>. Review Insight System Project Repository.</w:t>
       </w:r>
       <w:r>
         <w:rPr>
@@ -4290,20 +6738,30 @@
         <w:pStyle w:val="a0"/>
       </w:pPr>
       <w:r>
-        <w:t>The source code repository contains the full implementation of the data pipeline, model training scripts, evaluation results, and the Streamlit dashboard.</w:t>
+        <w:t xml:space="preserve">The source code repository contains the full implementation of the data pipeline, model training scripts, evaluation results, and the </w:t>
+      </w:r>
+      <w:proofErr w:type="spellStart"/>
+      <w:r>
+        <w:t>Streamlit</w:t>
+      </w:r>
+      <w:proofErr w:type="spellEnd"/>
+      <w:r>
+        <w:t xml:space="preserve"> dashboard.</w:t>
       </w:r>
     </w:p>
     <w:p>
       <w:pPr>
         <w:pStyle w:val="2"/>
       </w:pPr>
-      <w:bookmarkStart w:id="30" w:name="X74cf52754ce356f32bc42912e24735181ee320a"/>
-      <w:bookmarkEnd w:id="25"/>
-      <w:bookmarkEnd w:id="29"/>
+      <w:bookmarkStart w:id="58" w:name="_Toc228470879"/>
+      <w:bookmarkStart w:id="59" w:name="X74cf52754ce356f32bc42912e24735181ee320a"/>
+      <w:bookmarkEnd w:id="49"/>
+      <w:bookmarkEnd w:id="57"/>
       <w:r>
         <w:lastRenderedPageBreak/>
         <w:t>9. Individual Contribution of Each Team Member in the Project</w:t>
       </w:r>
+      <w:bookmarkEnd w:id="58"/>
     </w:p>
     <w:p>
       <w:pPr>
@@ -4388,7 +6846,15 @@
               <w:jc w:val="center"/>
             </w:pPr>
             <w:r>
-              <w:t>Defined the business problem, selected and processed the dataset, implemented review-value classification, calibrated sentiment labels, fine-tuned BERT sentiment model, generated complaint-title pseudo labels, fine-tuned Flan-T5 title-generation models, evaluated model performance, built the Streamlit dashboard, prepared documentation, and wrote the report.</w:t>
+              <w:t xml:space="preserve">Defined the business problem, selected and processed the dataset, implemented review-value classification, calibrated sentiment labels, fine-tuned BERT sentiment model, generated complaint-title pseudo labels, fine-tuned Flan-T5 title-generation models, evaluated model performance, built the </w:t>
+            </w:r>
+            <w:proofErr w:type="spellStart"/>
+            <w:r>
+              <w:t>Streamlit</w:t>
+            </w:r>
+            <w:proofErr w:type="spellEnd"/>
+            <w:r>
+              <w:t xml:space="preserve"> dashboard, prepared documentation, and wrote the report.</w:t>
             </w:r>
           </w:p>
         </w:tc>
@@ -4406,14 +6872,16 @@
       <w:pPr>
         <w:pStyle w:val="2"/>
       </w:pPr>
-      <w:bookmarkStart w:id="31" w:name="usage-of-genai-llms"/>
-      <w:bookmarkEnd w:id="30"/>
+      <w:bookmarkStart w:id="60" w:name="_Toc228470880"/>
+      <w:bookmarkStart w:id="61" w:name="usage-of-genai-llms"/>
+      <w:bookmarkEnd w:id="59"/>
       <w:r>
         <w:t>10. Usage of GenAI / LLMs</w:t>
       </w:r>
-    </w:p>
-    <w:bookmarkEnd w:id="0"/>
-    <w:bookmarkEnd w:id="31"/>
+      <w:bookmarkEnd w:id="60"/>
+    </w:p>
+    <w:bookmarkEnd w:id="2"/>
+    <w:bookmarkEnd w:id="61"/>
     <w:p>
       <w:pPr>
         <w:pStyle w:val="FirstParagraph"/>
@@ -4902,6 +7370,9 @@
     </w:pPrDefault>
   </w:docDefaults>
   <w:latentStyles w:defLockedState="0" w:defUIPriority="0" w:defSemiHidden="0" w:defUnhideWhenUsed="0" w:defQFormat="0" w:count="376">
+    <w:lsdException w:name="toc 2" w:uiPriority="39"/>
+    <w:lsdException w:name="toc 3" w:uiPriority="39"/>
+    <w:lsdException w:name="Hyperlink" w:uiPriority="99"/>
     <w:lsdException w:name="Normal Table" w:semiHidden="1" w:unhideWhenUsed="1"/>
     <w:lsdException w:name="Table Simple 1" w:semiHidden="1" w:unhideWhenUsed="1"/>
     <w:lsdException w:name="Table Simple 2" w:semiHidden="1" w:unhideWhenUsed="1"/>
@@ -5778,6 +8249,7 @@
   <w:style w:type="character" w:styleId="af">
     <w:name w:val="Hyperlink"/>
     <w:basedOn w:val="ad"/>
+    <w:uiPriority w:val="99"/>
     <w:rPr>
       <w:color w:val="156082" w:themeColor="accent1"/>
     </w:rPr>
@@ -6092,6 +8564,106 @@
       <w:rFonts w:ascii="Consolas" w:hAnsi="Consolas"/>
       <w:sz w:val="22"/>
     </w:rPr>
+  </w:style>
+  <w:style w:type="paragraph" w:customStyle="1" w:styleId="TOC11">
+    <w:name w:val="TOC 11"/>
+    <w:pPr>
+      <w:tabs>
+        <w:tab w:val="right" w:leader="dot" w:pos="8640"/>
+      </w:tabs>
+      <w:spacing w:after="80" w:line="259" w:lineRule="auto"/>
+    </w:pPr>
+    <w:rPr>
+      <w:rFonts w:ascii="Times New Roman" w:hAnsi="Times New Roman"/>
+      <w:sz w:val="22"/>
+    </w:rPr>
+  </w:style>
+  <w:style w:type="paragraph" w:customStyle="1" w:styleId="TOC21">
+    <w:name w:val="TOC 21"/>
+    <w:pPr>
+      <w:tabs>
+        <w:tab w:val="right" w:leader="dot" w:pos="8640"/>
+      </w:tabs>
+      <w:spacing w:after="80" w:line="259" w:lineRule="auto"/>
+    </w:pPr>
+    <w:rPr>
+      <w:rFonts w:ascii="Times New Roman" w:hAnsi="Times New Roman"/>
+      <w:sz w:val="22"/>
+    </w:rPr>
+  </w:style>
+  <w:style w:type="paragraph" w:customStyle="1" w:styleId="TOC31">
+    <w:name w:val="TOC 31"/>
+    <w:pPr>
+      <w:tabs>
+        <w:tab w:val="right" w:leader="dot" w:pos="8640"/>
+      </w:tabs>
+      <w:spacing w:after="80" w:line="259" w:lineRule="auto"/>
+    </w:pPr>
+    <w:rPr>
+      <w:rFonts w:ascii="Times New Roman" w:hAnsi="Times New Roman"/>
+      <w:sz w:val="22"/>
+    </w:rPr>
+  </w:style>
+  <w:style w:type="paragraph" w:customStyle="1" w:styleId="TOC12">
+    <w:name w:val="TOC 12"/>
+    <w:pPr>
+      <w:tabs>
+        <w:tab w:val="right" w:leader="dot" w:pos="8640"/>
+      </w:tabs>
+      <w:spacing w:after="80" w:line="259" w:lineRule="auto"/>
+    </w:pPr>
+    <w:rPr>
+      <w:rFonts w:ascii="Times New Roman" w:hAnsi="Times New Roman"/>
+      <w:sz w:val="22"/>
+    </w:rPr>
+  </w:style>
+  <w:style w:type="paragraph" w:customStyle="1" w:styleId="TOC22">
+    <w:name w:val="TOC 22"/>
+    <w:pPr>
+      <w:tabs>
+        <w:tab w:val="right" w:leader="dot" w:pos="8640"/>
+      </w:tabs>
+      <w:spacing w:after="80" w:line="259" w:lineRule="auto"/>
+    </w:pPr>
+    <w:rPr>
+      <w:rFonts w:ascii="Times New Roman" w:hAnsi="Times New Roman"/>
+      <w:sz w:val="22"/>
+    </w:rPr>
+  </w:style>
+  <w:style w:type="paragraph" w:customStyle="1" w:styleId="TOC32">
+    <w:name w:val="TOC 32"/>
+    <w:pPr>
+      <w:tabs>
+        <w:tab w:val="right" w:leader="dot" w:pos="8640"/>
+      </w:tabs>
+      <w:spacing w:after="80" w:line="259" w:lineRule="auto"/>
+    </w:pPr>
+    <w:rPr>
+      <w:rFonts w:ascii="Times New Roman" w:hAnsi="Times New Roman"/>
+      <w:sz w:val="22"/>
+    </w:rPr>
+  </w:style>
+  <w:style w:type="paragraph" w:styleId="TOC2">
+    <w:name w:val="toc 2"/>
+    <w:basedOn w:val="a"/>
+    <w:next w:val="a"/>
+    <w:autoRedefine/>
+    <w:uiPriority w:val="39"/>
+    <w:rsid w:val="0079654C"/>
+    <w:pPr>
+      <w:ind w:leftChars="200" w:left="420"/>
+    </w:pPr>
+  </w:style>
+  <w:style w:type="paragraph" w:styleId="TOC3">
+    <w:name w:val="toc 3"/>
+    <w:basedOn w:val="a"/>
+    <w:next w:val="a"/>
+    <w:autoRedefine/>
+    <w:uiPriority w:val="39"/>
+    <w:rsid w:val="0079654C"/>
+    <w:pPr>
+      <w:ind w:leftChars="400" w:left="840"/>
+    </w:pPr>
   </w:style>
 </w:styles>
 </file>

</xml_diff>